<commit_message>
feat: adicionado olhinho na senha e correção de URL da API
</commit_message>
<xml_diff>
--- a/public/e-Xpress_Documentação.docx
+++ b/public/e-Xpress_Documentação.docx
@@ -5,14 +5,1108 @@
     <w:p>
       <w:pPr>
         <w:rPr>
-          <w:rFonts w:ascii="Segoe UI Emoji" w:hAnsi="Segoe UI Emoji" w:cs="Segoe UI Emoji"/>
+          <w:rFonts w:ascii="Calibri" w:hAnsi="Calibri" w:cs="Calibri"/>
+          <w:sz w:val="24"/>
+          <w:szCs w:val="24"/>
+        </w:rPr>
+      </w:pPr>
+      <w:r>
+        <w:rPr>
+          <w:rFonts w:ascii="Calibri" w:hAnsi="Calibri" w:cs="Calibri"/>
+          <w:sz w:val="24"/>
+          <w:szCs w:val="24"/>
+        </w:rPr>
+        <w:t>Banco de dados:</w:t>
+      </w:r>
+    </w:p>
+    <w:p>
+      <w:pPr>
+        <w:rPr>
+          <w:rFonts w:ascii="Calibri" w:hAnsi="Calibri" w:cs="Calibri"/>
+          <w:sz w:val="24"/>
+          <w:szCs w:val="24"/>
+        </w:rPr>
+      </w:pPr>
+      <w:r>
+        <w:rPr>
+          <w:rFonts w:ascii="Calibri" w:hAnsi="Calibri" w:cs="Calibri"/>
+          <w:sz w:val="24"/>
+          <w:szCs w:val="24"/>
+        </w:rPr>
+        <w:t xml:space="preserve">Existe diversos tipos de banco de dados disponíveis, porém nesse trabalho, vamos falar do </w:t>
+      </w:r>
+      <w:r>
+        <w:rPr>
+          <w:rFonts w:ascii="Calibri" w:hAnsi="Calibri" w:cs="Calibri"/>
           <w:b/>
           <w:bCs/>
-        </w:rPr>
-      </w:pPr>
-      <w:r>
-        <w:rPr>
+          <w:sz w:val="24"/>
+          <w:szCs w:val="24"/>
+        </w:rPr>
+        <w:t>SQLite</w:t>
+      </w:r>
+      <w:r>
+        <w:rPr>
+          <w:rFonts w:ascii="Calibri" w:hAnsi="Calibri" w:cs="Calibri"/>
+          <w:sz w:val="24"/>
+          <w:szCs w:val="24"/>
+        </w:rPr>
+        <w:t xml:space="preserve"> e</w:t>
+      </w:r>
+      <w:r>
+        <w:rPr>
+          <w:rFonts w:ascii="Calibri" w:hAnsi="Calibri" w:cs="Calibri"/>
+          <w:sz w:val="24"/>
+          <w:szCs w:val="24"/>
+        </w:rPr>
+        <w:t xml:space="preserve"> do </w:t>
+      </w:r>
+      <w:r>
+        <w:rPr>
+          <w:rFonts w:ascii="Calibri" w:hAnsi="Calibri" w:cs="Calibri"/>
+          <w:b/>
+          <w:bCs/>
+          <w:sz w:val="24"/>
+          <w:szCs w:val="24"/>
+        </w:rPr>
+        <w:t>PostgreSQL</w:t>
+      </w:r>
+      <w:r>
+        <w:rPr>
+          <w:rFonts w:ascii="Calibri" w:hAnsi="Calibri" w:cs="Calibri"/>
+          <w:sz w:val="24"/>
+          <w:szCs w:val="24"/>
+        </w:rPr>
+        <w:t>.</w:t>
+      </w:r>
+    </w:p>
+    <w:p>
+      <w:pPr>
+        <w:rPr>
+          <w:rFonts w:ascii="Calibri" w:hAnsi="Calibri" w:cs="Calibri"/>
+          <w:sz w:val="24"/>
+          <w:szCs w:val="24"/>
+        </w:rPr>
+      </w:pPr>
+      <w:r>
+        <w:rPr>
+          <w:rFonts w:ascii="Calibri" w:hAnsi="Calibri" w:cs="Calibri"/>
+          <w:sz w:val="24"/>
+          <w:szCs w:val="24"/>
+        </w:rPr>
+        <w:t xml:space="preserve">Aqui estão </w:t>
+      </w:r>
+      <w:r>
+        <w:rPr>
+          <w:rFonts w:ascii="Calibri" w:hAnsi="Calibri" w:cs="Calibri"/>
+          <w:sz w:val="24"/>
+          <w:szCs w:val="24"/>
+        </w:rPr>
+        <w:t xml:space="preserve">algumas informações de ambas as ferramentas para elaboração de </w:t>
+      </w:r>
+      <w:r>
+        <w:rPr>
+          <w:rFonts w:ascii="Calibri" w:hAnsi="Calibri" w:cs="Calibri"/>
+          <w:sz w:val="24"/>
+          <w:szCs w:val="24"/>
+        </w:rPr>
+        <w:t>documentação:</w:t>
+      </w:r>
+    </w:p>
+    <w:p>
+      <w:pPr>
+        <w:rPr>
+          <w:rFonts w:ascii="Calibri" w:hAnsi="Calibri" w:cs="Calibri"/>
+          <w:b/>
+          <w:bCs/>
+          <w:sz w:val="24"/>
+          <w:szCs w:val="24"/>
+        </w:rPr>
+      </w:pPr>
+      <w:r>
+        <w:rPr>
+          <w:rFonts w:ascii="Calibri" w:hAnsi="Calibri" w:cs="Calibri"/>
+          <w:b/>
+          <w:bCs/>
+          <w:sz w:val="24"/>
+          <w:szCs w:val="24"/>
+        </w:rPr>
+        <w:t>Por que o PostgreSQL é a recomendação para o sistema online?</w:t>
+      </w:r>
+    </w:p>
+    <w:p>
+      <w:pPr>
+        <w:numPr>
+          <w:ilvl w:val="0"/>
+          <w:numId w:val="6"/>
+        </w:numPr>
+        <w:rPr>
+          <w:rFonts w:ascii="Calibri" w:hAnsi="Calibri" w:cs="Calibri"/>
+          <w:sz w:val="24"/>
+          <w:szCs w:val="24"/>
+        </w:rPr>
+      </w:pPr>
+      <w:r>
+        <w:rPr>
+          <w:rFonts w:ascii="Calibri" w:hAnsi="Calibri" w:cs="Calibri"/>
+          <w:b/>
+          <w:bCs/>
+          <w:sz w:val="24"/>
+          <w:szCs w:val="24"/>
+        </w:rPr>
+        <w:t>Persistência de Dados na Nuvem:</w:t>
+      </w:r>
+      <w:r>
+        <w:rPr>
+          <w:rFonts w:ascii="Calibri" w:hAnsi="Calibri" w:cs="Calibri"/>
+          <w:sz w:val="24"/>
+          <w:szCs w:val="24"/>
+        </w:rPr>
+        <w:t xml:space="preserve"> No plano gratuito da Render, arquivos como database.db</w:t>
+      </w:r>
+      <w:r>
+        <w:rPr>
+          <w:rFonts w:ascii="Calibri" w:hAnsi="Calibri" w:cs="Calibri"/>
+          <w:sz w:val="24"/>
+          <w:szCs w:val="24"/>
+        </w:rPr>
+        <w:t xml:space="preserve"> (criado pelo programador)</w:t>
+      </w:r>
+      <w:r>
+        <w:rPr>
+          <w:rFonts w:ascii="Calibri" w:hAnsi="Calibri" w:cs="Calibri"/>
+          <w:sz w:val="24"/>
+          <w:szCs w:val="24"/>
+        </w:rPr>
+        <w:t xml:space="preserve"> do </w:t>
+      </w:r>
+      <w:r>
+        <w:rPr>
+          <w:rFonts w:ascii="Calibri" w:hAnsi="Calibri" w:cs="Calibri"/>
+          <w:b/>
+          <w:bCs/>
+          <w:sz w:val="24"/>
+          <w:szCs w:val="24"/>
+        </w:rPr>
+        <w:t>SQLite</w:t>
+      </w:r>
+      <w:r>
+        <w:rPr>
+          <w:rFonts w:ascii="Calibri" w:hAnsi="Calibri" w:cs="Calibri"/>
+          <w:sz w:val="24"/>
+          <w:szCs w:val="24"/>
+        </w:rPr>
+        <w:t xml:space="preserve"> são deletados toda vez que o servidor entra em repouso. Com o </w:t>
+      </w:r>
+      <w:r>
+        <w:rPr>
+          <w:rFonts w:ascii="Calibri" w:hAnsi="Calibri" w:cs="Calibri"/>
+          <w:b/>
+          <w:bCs/>
+          <w:sz w:val="24"/>
+          <w:szCs w:val="24"/>
+        </w:rPr>
+        <w:t>PostgreSQL</w:t>
+      </w:r>
+      <w:r>
+        <w:rPr>
+          <w:rFonts w:ascii="Calibri" w:hAnsi="Calibri" w:cs="Calibri"/>
+          <w:sz w:val="24"/>
+          <w:szCs w:val="24"/>
+        </w:rPr>
+        <w:t>, os dados ficam em um servidor de banco de dados separado e nunca são apagados.</w:t>
+      </w:r>
+    </w:p>
+    <w:p>
+      <w:pPr>
+        <w:numPr>
+          <w:ilvl w:val="0"/>
+          <w:numId w:val="6"/>
+        </w:numPr>
+        <w:rPr>
+          <w:rFonts w:ascii="Calibri" w:hAnsi="Calibri" w:cs="Calibri"/>
+          <w:sz w:val="24"/>
+          <w:szCs w:val="24"/>
+        </w:rPr>
+      </w:pPr>
+      <w:r>
+        <w:rPr>
+          <w:rFonts w:ascii="Calibri" w:hAnsi="Calibri" w:cs="Calibri"/>
+          <w:b/>
+          <w:bCs/>
+          <w:sz w:val="24"/>
+          <w:szCs w:val="24"/>
+        </w:rPr>
+        <w:t>Acesso Simultâneo:</w:t>
+      </w:r>
+      <w:r>
+        <w:rPr>
+          <w:rFonts w:ascii="Calibri" w:hAnsi="Calibri" w:cs="Calibri"/>
+          <w:sz w:val="24"/>
+          <w:szCs w:val="24"/>
+        </w:rPr>
+        <w:t xml:space="preserve"> O </w:t>
+      </w:r>
+      <w:r>
+        <w:rPr>
+          <w:rFonts w:ascii="Calibri" w:hAnsi="Calibri" w:cs="Calibri"/>
+          <w:b/>
+          <w:bCs/>
+          <w:sz w:val="24"/>
+          <w:szCs w:val="24"/>
+        </w:rPr>
+        <w:t>SQLite</w:t>
+      </w:r>
+      <w:r>
+        <w:rPr>
+          <w:rFonts w:ascii="Calibri" w:hAnsi="Calibri" w:cs="Calibri"/>
+          <w:sz w:val="24"/>
+          <w:szCs w:val="24"/>
+        </w:rPr>
+        <w:t xml:space="preserve"> pode ter problemas se muitos usuários tentarem gravar dados ao mesmo tempo, enquanto o </w:t>
+      </w:r>
+      <w:r>
+        <w:rPr>
+          <w:rFonts w:ascii="Calibri" w:hAnsi="Calibri" w:cs="Calibri"/>
+          <w:b/>
+          <w:bCs/>
+          <w:sz w:val="24"/>
+          <w:szCs w:val="24"/>
+        </w:rPr>
+        <w:t>PostgreSQL</w:t>
+      </w:r>
+      <w:r>
+        <w:rPr>
+          <w:rFonts w:ascii="Calibri" w:hAnsi="Calibri" w:cs="Calibri"/>
+          <w:sz w:val="24"/>
+          <w:szCs w:val="24"/>
+        </w:rPr>
+        <w:t xml:space="preserve"> foi feito para lidar com milhares de acessos simultâneos, o que é ideal para um sistema de logística e mercado.</w:t>
+      </w:r>
+    </w:p>
+    <w:p>
+      <w:pPr>
+        <w:rPr>
+          <w:rFonts w:ascii="Calibri" w:hAnsi="Calibri" w:cs="Calibri"/>
+          <w:sz w:val="24"/>
+          <w:szCs w:val="24"/>
+        </w:rPr>
+      </w:pPr>
+      <w:r>
+        <w:rPr>
+          <w:rFonts w:ascii="Calibri" w:hAnsi="Calibri" w:cs="Calibri"/>
+          <w:sz w:val="24"/>
+          <w:szCs w:val="24"/>
+        </w:rPr>
+        <w:t xml:space="preserve">Senha APP: </w:t>
+      </w:r>
+      <w:r>
+        <w:rPr>
+          <w:rFonts w:ascii="Calibri" w:hAnsi="Calibri" w:cs="Calibri"/>
+          <w:sz w:val="24"/>
+          <w:szCs w:val="24"/>
+        </w:rPr>
+        <w:t>eypkhbrbqfxodsqn</w:t>
+      </w:r>
+    </w:p>
+    <w:p>
+      <w:pPr>
+        <w:rPr>
+          <w:rFonts w:ascii="Calibri" w:hAnsi="Calibri" w:cs="Calibri"/>
+          <w:sz w:val="24"/>
+          <w:szCs w:val="24"/>
+        </w:rPr>
+      </w:pPr>
+    </w:p>
+    <w:p>
+      <w:pPr>
+        <w:rPr>
+          <w:rFonts w:ascii="Calibri" w:hAnsi="Calibri" w:cs="Calibri"/>
+          <w:sz w:val="24"/>
+          <w:szCs w:val="24"/>
+          <w:lang w:val="en-US"/>
+        </w:rPr>
+      </w:pPr>
+      <w:r>
+        <w:rPr>
+          <w:rFonts w:ascii="Calibri" w:hAnsi="Calibri" w:cs="Calibri"/>
+          <w:sz w:val="24"/>
+          <w:szCs w:val="24"/>
+          <w:lang w:val="en-US"/>
+        </w:rPr>
+        <w:t xml:space="preserve">1. </w:t>
+      </w:r>
+      <w:proofErr w:type="spellStart"/>
+      <w:r>
+        <w:rPr>
+          <w:rFonts w:ascii="Calibri" w:hAnsi="Calibri" w:cs="Calibri"/>
+          <w:sz w:val="24"/>
+          <w:szCs w:val="24"/>
+          <w:lang w:val="en-US"/>
+        </w:rPr>
+        <w:t>npm</w:t>
+      </w:r>
+      <w:proofErr w:type="spellEnd"/>
+      <w:r>
+        <w:rPr>
+          <w:rFonts w:ascii="Calibri" w:hAnsi="Calibri" w:cs="Calibri"/>
+          <w:sz w:val="24"/>
+          <w:szCs w:val="24"/>
+          <w:lang w:val="en-US"/>
+        </w:rPr>
+        <w:t xml:space="preserve"> run dev (O Frontend)</w:t>
+      </w:r>
+    </w:p>
+    <w:p>
+      <w:pPr>
+        <w:rPr>
+          <w:rFonts w:ascii="Calibri" w:hAnsi="Calibri" w:cs="Calibri"/>
+          <w:sz w:val="24"/>
+          <w:szCs w:val="24"/>
+        </w:rPr>
+      </w:pPr>
+      <w:r>
+        <w:rPr>
+          <w:rFonts w:ascii="Calibri" w:hAnsi="Calibri" w:cs="Calibri"/>
+          <w:sz w:val="24"/>
+          <w:szCs w:val="24"/>
+        </w:rPr>
+        <w:t>Este comando é usado para rodar a parte visual do seu sistema (React + Vite).</w:t>
+      </w:r>
+    </w:p>
+    <w:p>
+      <w:pPr>
+        <w:numPr>
+          <w:ilvl w:val="0"/>
+          <w:numId w:val="4"/>
+        </w:numPr>
+        <w:rPr>
+          <w:rFonts w:ascii="Calibri" w:hAnsi="Calibri" w:cs="Calibri"/>
+          <w:sz w:val="24"/>
+          <w:szCs w:val="24"/>
+        </w:rPr>
+      </w:pPr>
+      <w:r>
+        <w:rPr>
+          <w:rFonts w:ascii="Calibri" w:hAnsi="Calibri" w:cs="Calibri"/>
+          <w:sz w:val="24"/>
+          <w:szCs w:val="24"/>
+        </w:rPr>
+        <w:t>O que ele faz: Ele inicia um servidor de desenvolvimento local (geralmente no endereço http://localhost:3000).</w:t>
+      </w:r>
+    </w:p>
+    <w:p>
+      <w:pPr>
+        <w:numPr>
+          <w:ilvl w:val="0"/>
+          <w:numId w:val="4"/>
+        </w:numPr>
+        <w:rPr>
+          <w:rFonts w:ascii="Calibri" w:hAnsi="Calibri" w:cs="Calibri"/>
+          <w:sz w:val="24"/>
+          <w:szCs w:val="24"/>
+        </w:rPr>
+      </w:pPr>
+      <w:r>
+        <w:rPr>
+          <w:rFonts w:ascii="Calibri" w:hAnsi="Calibri" w:cs="Calibri"/>
+          <w:sz w:val="24"/>
+          <w:szCs w:val="24"/>
+        </w:rPr>
+        <w:t>Função Principal: Ele compila o seu código TypeScript (.</w:t>
+      </w:r>
+      <w:proofErr w:type="spellStart"/>
+      <w:r>
+        <w:rPr>
+          <w:rFonts w:ascii="Calibri" w:hAnsi="Calibri" w:cs="Calibri"/>
+          <w:sz w:val="24"/>
+          <w:szCs w:val="24"/>
+        </w:rPr>
+        <w:t>tsx</w:t>
+      </w:r>
+      <w:proofErr w:type="spellEnd"/>
+      <w:r>
+        <w:rPr>
+          <w:rFonts w:ascii="Calibri" w:hAnsi="Calibri" w:cs="Calibri"/>
+          <w:sz w:val="24"/>
+          <w:szCs w:val="24"/>
+        </w:rPr>
+        <w:t>) e CSS para que o navegador consiga entender.</w:t>
+      </w:r>
+    </w:p>
+    <w:p>
+      <w:pPr>
+        <w:numPr>
+          <w:ilvl w:val="0"/>
+          <w:numId w:val="4"/>
+        </w:numPr>
+        <w:rPr>
+          <w:rFonts w:ascii="Calibri" w:hAnsi="Calibri" w:cs="Calibri"/>
+          <w:sz w:val="24"/>
+          <w:szCs w:val="24"/>
+        </w:rPr>
+      </w:pPr>
+      <w:r>
+        <w:rPr>
+          <w:rFonts w:ascii="Calibri" w:hAnsi="Calibri" w:cs="Calibri"/>
+          <w:sz w:val="24"/>
+          <w:szCs w:val="24"/>
+        </w:rPr>
+        <w:t xml:space="preserve">Diferencial: Ele possui o "Hot Module </w:t>
+      </w:r>
+      <w:proofErr w:type="spellStart"/>
+      <w:r>
+        <w:rPr>
+          <w:rFonts w:ascii="Calibri" w:hAnsi="Calibri" w:cs="Calibri"/>
+          <w:sz w:val="24"/>
+          <w:szCs w:val="24"/>
+        </w:rPr>
+        <w:t>Replacement</w:t>
+      </w:r>
+      <w:proofErr w:type="spellEnd"/>
+      <w:r>
+        <w:rPr>
+          <w:rFonts w:ascii="Calibri" w:hAnsi="Calibri" w:cs="Calibri"/>
+          <w:sz w:val="24"/>
+          <w:szCs w:val="24"/>
+        </w:rPr>
+        <w:t xml:space="preserve">" (HMR). Isso significa que, toda vez que você altera algo em um componente como o </w:t>
+      </w:r>
+      <w:proofErr w:type="spellStart"/>
+      <w:r>
+        <w:rPr>
+          <w:rFonts w:ascii="Calibri" w:hAnsi="Calibri" w:cs="Calibri"/>
+          <w:sz w:val="24"/>
+          <w:szCs w:val="24"/>
+        </w:rPr>
+        <w:t>Navbar.tsx</w:t>
+      </w:r>
+      <w:proofErr w:type="spellEnd"/>
+      <w:r>
+        <w:rPr>
+          <w:rFonts w:ascii="Calibri" w:hAnsi="Calibri" w:cs="Calibri"/>
+          <w:sz w:val="24"/>
+          <w:szCs w:val="24"/>
+        </w:rPr>
+        <w:t>, a tela do navegador atualiza instantaneamente sem você precisar recarregar a página.</w:t>
+      </w:r>
+    </w:p>
+    <w:p>
+      <w:pPr>
+        <w:rPr>
+          <w:rFonts w:ascii="Calibri" w:hAnsi="Calibri" w:cs="Calibri"/>
+          <w:sz w:val="24"/>
+          <w:szCs w:val="24"/>
+        </w:rPr>
+      </w:pPr>
+      <w:r>
+        <w:rPr>
+          <w:rFonts w:ascii="Calibri" w:hAnsi="Calibri" w:cs="Calibri"/>
+          <w:sz w:val="24"/>
+          <w:szCs w:val="24"/>
+        </w:rPr>
+        <w:t xml:space="preserve">2. node server.js (O </w:t>
+      </w:r>
+      <w:proofErr w:type="spellStart"/>
+      <w:r>
+        <w:rPr>
+          <w:rFonts w:ascii="Calibri" w:hAnsi="Calibri" w:cs="Calibri"/>
+          <w:sz w:val="24"/>
+          <w:szCs w:val="24"/>
+        </w:rPr>
+        <w:t>Backend</w:t>
+      </w:r>
+      <w:proofErr w:type="spellEnd"/>
+      <w:r>
+        <w:rPr>
+          <w:rFonts w:ascii="Calibri" w:hAnsi="Calibri" w:cs="Calibri"/>
+          <w:sz w:val="24"/>
+          <w:szCs w:val="24"/>
+        </w:rPr>
+        <w:t>)</w:t>
+      </w:r>
+    </w:p>
+    <w:p>
+      <w:pPr>
+        <w:rPr>
+          <w:rFonts w:ascii="Calibri" w:hAnsi="Calibri" w:cs="Calibri"/>
+          <w:sz w:val="24"/>
+          <w:szCs w:val="24"/>
+        </w:rPr>
+      </w:pPr>
+      <w:r>
+        <w:rPr>
+          <w:rFonts w:ascii="Calibri" w:hAnsi="Calibri" w:cs="Calibri"/>
+          <w:sz w:val="24"/>
+          <w:szCs w:val="24"/>
+        </w:rPr>
+        <w:t>Este comando inicia o seu servidor "por trás das câmeras" usando o ambiente Node.js.</w:t>
+      </w:r>
+    </w:p>
+    <w:p>
+      <w:pPr>
+        <w:numPr>
+          <w:ilvl w:val="0"/>
+          <w:numId w:val="5"/>
+        </w:numPr>
+        <w:rPr>
+          <w:rFonts w:ascii="Calibri" w:hAnsi="Calibri" w:cs="Calibri"/>
+          <w:sz w:val="24"/>
+          <w:szCs w:val="24"/>
+        </w:rPr>
+      </w:pPr>
+      <w:r>
+        <w:rPr>
+          <w:rFonts w:ascii="Calibri" w:hAnsi="Calibri" w:cs="Calibri"/>
+          <w:sz w:val="24"/>
+          <w:szCs w:val="24"/>
+        </w:rPr>
+        <w:t>O que ele faz: Ele executa o arquivo server.js, que é o cérebro da sua API.</w:t>
+      </w:r>
+    </w:p>
+    <w:p>
+      <w:pPr>
+        <w:numPr>
+          <w:ilvl w:val="0"/>
+          <w:numId w:val="5"/>
+        </w:numPr>
+        <w:rPr>
+          <w:rFonts w:ascii="Calibri" w:hAnsi="Calibri" w:cs="Calibri"/>
+          <w:sz w:val="24"/>
+          <w:szCs w:val="24"/>
+        </w:rPr>
+      </w:pPr>
+      <w:r>
+        <w:rPr>
+          <w:rFonts w:ascii="Calibri" w:hAnsi="Calibri" w:cs="Calibri"/>
+          <w:sz w:val="24"/>
+          <w:szCs w:val="24"/>
+        </w:rPr>
+        <w:t>Função Principal: Ele ativa a conexão com o banco de dados SQLite (database.db) e abre as "portas" (como a porta 5000) para receber as requisições de login, cadastro e recuperação de senha.</w:t>
+      </w:r>
+    </w:p>
+    <w:p>
+      <w:pPr>
+        <w:numPr>
+          <w:ilvl w:val="0"/>
+          <w:numId w:val="5"/>
+        </w:numPr>
+        <w:rPr>
+          <w:rFonts w:ascii="Calibri" w:hAnsi="Calibri" w:cs="Calibri"/>
+          <w:sz w:val="24"/>
+          <w:szCs w:val="24"/>
+        </w:rPr>
+      </w:pPr>
+      <w:r>
+        <w:rPr>
+          <w:rFonts w:ascii="Calibri" w:hAnsi="Calibri" w:cs="Calibri"/>
+          <w:sz w:val="24"/>
+          <w:szCs w:val="24"/>
+        </w:rPr>
+        <w:t xml:space="preserve">Sem Interface: Diferente do </w:t>
+      </w:r>
+      <w:proofErr w:type="spellStart"/>
+      <w:r>
+        <w:rPr>
+          <w:rFonts w:ascii="Calibri" w:hAnsi="Calibri" w:cs="Calibri"/>
+          <w:sz w:val="24"/>
+          <w:szCs w:val="24"/>
+        </w:rPr>
+        <w:t>npm</w:t>
+      </w:r>
+      <w:proofErr w:type="spellEnd"/>
+      <w:r>
+        <w:rPr>
+          <w:rFonts w:ascii="Calibri" w:hAnsi="Calibri" w:cs="Calibri"/>
+          <w:sz w:val="24"/>
+          <w:szCs w:val="24"/>
+        </w:rPr>
+        <w:t xml:space="preserve"> run </w:t>
+      </w:r>
+      <w:proofErr w:type="spellStart"/>
+      <w:r>
+        <w:rPr>
+          <w:rFonts w:ascii="Calibri" w:hAnsi="Calibri" w:cs="Calibri"/>
+          <w:sz w:val="24"/>
+          <w:szCs w:val="24"/>
+        </w:rPr>
+        <w:t>dev</w:t>
+      </w:r>
+      <w:proofErr w:type="spellEnd"/>
+      <w:r>
+        <w:rPr>
+          <w:rFonts w:ascii="Calibri" w:hAnsi="Calibri" w:cs="Calibri"/>
+          <w:sz w:val="24"/>
+          <w:szCs w:val="24"/>
+        </w:rPr>
+        <w:t xml:space="preserve">, este comando não abre uma página no navegador. Ele apenas deixa o servidor "ouvindo" as instruções que o </w:t>
+      </w:r>
+      <w:proofErr w:type="spellStart"/>
+      <w:r>
+        <w:rPr>
+          <w:rFonts w:ascii="Calibri" w:hAnsi="Calibri" w:cs="Calibri"/>
+          <w:sz w:val="24"/>
+          <w:szCs w:val="24"/>
+        </w:rPr>
+        <w:t>frontend</w:t>
+      </w:r>
+      <w:proofErr w:type="spellEnd"/>
+      <w:r>
+        <w:rPr>
+          <w:rFonts w:ascii="Calibri" w:hAnsi="Calibri" w:cs="Calibri"/>
+          <w:sz w:val="24"/>
+          <w:szCs w:val="24"/>
+        </w:rPr>
+        <w:t xml:space="preserve"> envia.</w:t>
+      </w:r>
+    </w:p>
+    <w:p>
+      <w:pPr>
+        <w:rPr>
+          <w:rFonts w:ascii="Calibri" w:hAnsi="Calibri" w:cs="Calibri"/>
+          <w:sz w:val="24"/>
+          <w:szCs w:val="24"/>
+        </w:rPr>
+      </w:pPr>
+      <w:r>
+        <w:rPr>
+          <w:rFonts w:ascii="Calibri" w:hAnsi="Calibri" w:cs="Calibri"/>
+          <w:sz w:val="24"/>
+          <w:szCs w:val="24"/>
+        </w:rPr>
+        <w:pict w14:anchorId="5594E2B3">
+          <v:rect id="_x0000_i1025" style="width:0;height:1.5pt" o:hralign="center" o:hrstd="t" o:hr="t" fillcolor="#a0a0a0" stroked="f"/>
+        </w:pict>
+      </w:r>
+    </w:p>
+    <w:p>
+      <w:pPr>
+        <w:rPr>
+          <w:rFonts w:ascii="Calibri" w:hAnsi="Calibri" w:cs="Calibri"/>
+          <w:sz w:val="24"/>
+          <w:szCs w:val="24"/>
+        </w:rPr>
+      </w:pPr>
+      <w:r>
+        <w:rPr>
+          <w:rFonts w:ascii="Segoe UI Emoji" w:hAnsi="Segoe UI Emoji" w:cs="Segoe UI Emoji"/>
+          <w:sz w:val="24"/>
+          <w:szCs w:val="24"/>
+        </w:rPr>
+        <w:lastRenderedPageBreak/>
+        <w:t>💡</w:t>
+      </w:r>
+      <w:r>
+        <w:rPr>
+          <w:rFonts w:ascii="Calibri" w:hAnsi="Calibri" w:cs="Calibri"/>
+          <w:sz w:val="24"/>
+          <w:szCs w:val="24"/>
+        </w:rPr>
+        <w:t xml:space="preserve"> Resumo para sua Documentação</w:t>
+      </w:r>
+    </w:p>
+    <w:tbl>
+      <w:tblPr>
+        <w:tblW w:w="0" w:type="auto"/>
+        <w:tblCellSpacing w:w="15" w:type="dxa"/>
+        <w:tblCellMar>
+          <w:top w:w="15" w:type="dxa"/>
+          <w:left w:w="15" w:type="dxa"/>
+          <w:bottom w:w="15" w:type="dxa"/>
+          <w:right w:w="15" w:type="dxa"/>
+        </w:tblCellMar>
+        <w:tblLook w:val="04A0" w:firstRow="1" w:lastRow="0" w:firstColumn="1" w:lastColumn="0" w:noHBand="0" w:noVBand="1"/>
+      </w:tblPr>
+      <w:tblGrid>
+        <w:gridCol w:w="1321"/>
+        <w:gridCol w:w="1973"/>
+        <w:gridCol w:w="5194"/>
+      </w:tblGrid>
+      <w:tr>
+        <w:trPr>
+          <w:tblHeader/>
+          <w:tblCellSpacing w:w="15" w:type="dxa"/>
+        </w:trPr>
+        <w:tc>
+          <w:tcPr>
+            <w:tcW w:w="0" w:type="auto"/>
+            <w:tcBorders>
+              <w:top w:val="single" w:sz="6" w:space="0" w:color="auto"/>
+              <w:left w:val="single" w:sz="6" w:space="0" w:color="auto"/>
+              <w:bottom w:val="single" w:sz="6" w:space="0" w:color="auto"/>
+              <w:right w:val="single" w:sz="6" w:space="0" w:color="auto"/>
+            </w:tcBorders>
+            <w:vAlign w:val="center"/>
+            <w:hideMark/>
+          </w:tcPr>
+          <w:p>
+            <w:pPr>
+              <w:rPr>
+                <w:rFonts w:ascii="Calibri" w:hAnsi="Calibri" w:cs="Calibri"/>
+                <w:sz w:val="24"/>
+                <w:szCs w:val="24"/>
+              </w:rPr>
+            </w:pPr>
+            <w:r>
+              <w:rPr>
+                <w:rFonts w:ascii="Calibri" w:hAnsi="Calibri" w:cs="Calibri"/>
+                <w:sz w:val="24"/>
+                <w:szCs w:val="24"/>
+              </w:rPr>
+              <w:t>Comando</w:t>
+            </w:r>
+          </w:p>
+        </w:tc>
+        <w:tc>
+          <w:tcPr>
+            <w:tcW w:w="0" w:type="auto"/>
+            <w:tcBorders>
+              <w:top w:val="single" w:sz="6" w:space="0" w:color="auto"/>
+              <w:left w:val="single" w:sz="6" w:space="0" w:color="auto"/>
+              <w:bottom w:val="single" w:sz="6" w:space="0" w:color="auto"/>
+              <w:right w:val="single" w:sz="6" w:space="0" w:color="auto"/>
+            </w:tcBorders>
+            <w:vAlign w:val="center"/>
+            <w:hideMark/>
+          </w:tcPr>
+          <w:p>
+            <w:pPr>
+              <w:rPr>
+                <w:rFonts w:ascii="Calibri" w:hAnsi="Calibri" w:cs="Calibri"/>
+                <w:sz w:val="24"/>
+                <w:szCs w:val="24"/>
+              </w:rPr>
+            </w:pPr>
+            <w:r>
+              <w:rPr>
+                <w:rFonts w:ascii="Calibri" w:hAnsi="Calibri" w:cs="Calibri"/>
+                <w:sz w:val="24"/>
+                <w:szCs w:val="24"/>
+              </w:rPr>
+              <w:t>Onde atua</w:t>
+            </w:r>
+          </w:p>
+        </w:tc>
+        <w:tc>
+          <w:tcPr>
+            <w:tcW w:w="0" w:type="auto"/>
+            <w:tcBorders>
+              <w:top w:val="single" w:sz="6" w:space="0" w:color="auto"/>
+              <w:left w:val="single" w:sz="6" w:space="0" w:color="auto"/>
+              <w:bottom w:val="single" w:sz="6" w:space="0" w:color="auto"/>
+              <w:right w:val="single" w:sz="6" w:space="0" w:color="auto"/>
+            </w:tcBorders>
+            <w:vAlign w:val="center"/>
+            <w:hideMark/>
+          </w:tcPr>
+          <w:p>
+            <w:pPr>
+              <w:rPr>
+                <w:rFonts w:ascii="Calibri" w:hAnsi="Calibri" w:cs="Calibri"/>
+                <w:sz w:val="24"/>
+                <w:szCs w:val="24"/>
+              </w:rPr>
+            </w:pPr>
+            <w:r>
+              <w:rPr>
+                <w:rFonts w:ascii="Calibri" w:hAnsi="Calibri" w:cs="Calibri"/>
+                <w:sz w:val="24"/>
+                <w:szCs w:val="24"/>
+              </w:rPr>
+              <w:t>O que o usuário vê?</w:t>
+            </w:r>
+          </w:p>
+        </w:tc>
+      </w:tr>
+      <w:tr>
+        <w:trPr>
+          <w:tblCellSpacing w:w="15" w:type="dxa"/>
+        </w:trPr>
+        <w:tc>
+          <w:tcPr>
+            <w:tcW w:w="0" w:type="auto"/>
+            <w:tcBorders>
+              <w:top w:val="single" w:sz="6" w:space="0" w:color="auto"/>
+              <w:left w:val="single" w:sz="6" w:space="0" w:color="auto"/>
+              <w:bottom w:val="single" w:sz="6" w:space="0" w:color="auto"/>
+              <w:right w:val="single" w:sz="6" w:space="0" w:color="auto"/>
+            </w:tcBorders>
+            <w:vAlign w:val="center"/>
+            <w:hideMark/>
+          </w:tcPr>
+          <w:p>
+            <w:pPr>
+              <w:rPr>
+                <w:rFonts w:ascii="Calibri" w:hAnsi="Calibri" w:cs="Calibri"/>
+                <w:sz w:val="24"/>
+                <w:szCs w:val="24"/>
+              </w:rPr>
+            </w:pPr>
+            <w:proofErr w:type="spellStart"/>
+            <w:r>
+              <w:rPr>
+                <w:rFonts w:ascii="Calibri" w:hAnsi="Calibri" w:cs="Calibri"/>
+                <w:sz w:val="24"/>
+                <w:szCs w:val="24"/>
+              </w:rPr>
+              <w:t>npm</w:t>
+            </w:r>
+            <w:proofErr w:type="spellEnd"/>
+            <w:r>
+              <w:rPr>
+                <w:rFonts w:ascii="Calibri" w:hAnsi="Calibri" w:cs="Calibri"/>
+                <w:sz w:val="24"/>
+                <w:szCs w:val="24"/>
+              </w:rPr>
+              <w:t xml:space="preserve"> run </w:t>
+            </w:r>
+            <w:proofErr w:type="spellStart"/>
+            <w:r>
+              <w:rPr>
+                <w:rFonts w:ascii="Calibri" w:hAnsi="Calibri" w:cs="Calibri"/>
+                <w:sz w:val="24"/>
+                <w:szCs w:val="24"/>
+              </w:rPr>
+              <w:t>dev</w:t>
+            </w:r>
+            <w:proofErr w:type="spellEnd"/>
+          </w:p>
+        </w:tc>
+        <w:tc>
+          <w:tcPr>
+            <w:tcW w:w="0" w:type="auto"/>
+            <w:tcBorders>
+              <w:top w:val="single" w:sz="6" w:space="0" w:color="auto"/>
+              <w:left w:val="single" w:sz="6" w:space="0" w:color="auto"/>
+              <w:bottom w:val="single" w:sz="6" w:space="0" w:color="auto"/>
+              <w:right w:val="single" w:sz="6" w:space="0" w:color="auto"/>
+            </w:tcBorders>
+            <w:vAlign w:val="center"/>
+            <w:hideMark/>
+          </w:tcPr>
+          <w:p>
+            <w:pPr>
+              <w:rPr>
+                <w:rFonts w:ascii="Calibri" w:hAnsi="Calibri" w:cs="Calibri"/>
+                <w:sz w:val="24"/>
+                <w:szCs w:val="24"/>
+              </w:rPr>
+            </w:pPr>
+            <w:proofErr w:type="spellStart"/>
+            <w:r>
+              <w:rPr>
+                <w:rFonts w:ascii="Calibri" w:hAnsi="Calibri" w:cs="Calibri"/>
+                <w:sz w:val="24"/>
+                <w:szCs w:val="24"/>
+              </w:rPr>
+              <w:t>Frontend</w:t>
+            </w:r>
+            <w:proofErr w:type="spellEnd"/>
+            <w:r>
+              <w:rPr>
+                <w:rFonts w:ascii="Calibri" w:hAnsi="Calibri" w:cs="Calibri"/>
+                <w:sz w:val="24"/>
+                <w:szCs w:val="24"/>
+              </w:rPr>
+              <w:t xml:space="preserve"> (Vite/React)</w:t>
+            </w:r>
+          </w:p>
+        </w:tc>
+        <w:tc>
+          <w:tcPr>
+            <w:tcW w:w="0" w:type="auto"/>
+            <w:tcBorders>
+              <w:top w:val="single" w:sz="6" w:space="0" w:color="auto"/>
+              <w:left w:val="single" w:sz="6" w:space="0" w:color="auto"/>
+              <w:bottom w:val="single" w:sz="6" w:space="0" w:color="auto"/>
+              <w:right w:val="single" w:sz="6" w:space="0" w:color="auto"/>
+            </w:tcBorders>
+            <w:vAlign w:val="center"/>
+            <w:hideMark/>
+          </w:tcPr>
+          <w:p>
+            <w:pPr>
+              <w:rPr>
+                <w:rFonts w:ascii="Calibri" w:hAnsi="Calibri" w:cs="Calibri"/>
+                <w:sz w:val="24"/>
+                <w:szCs w:val="24"/>
+              </w:rPr>
+            </w:pPr>
+            <w:r>
+              <w:rPr>
+                <w:rFonts w:ascii="Calibri" w:hAnsi="Calibri" w:cs="Calibri"/>
+                <w:sz w:val="24"/>
+                <w:szCs w:val="24"/>
+              </w:rPr>
+              <w:t xml:space="preserve">As telas, botões, cores e a interface do </w:t>
+            </w:r>
+            <w:proofErr w:type="spellStart"/>
+            <w:r>
+              <w:rPr>
+                <w:rFonts w:ascii="Calibri" w:hAnsi="Calibri" w:cs="Calibri"/>
+                <w:sz w:val="24"/>
+                <w:szCs w:val="24"/>
+              </w:rPr>
+              <w:t>e-Xpress</w:t>
+            </w:r>
+            <w:proofErr w:type="spellEnd"/>
+            <w:r>
+              <w:rPr>
+                <w:rFonts w:ascii="Calibri" w:hAnsi="Calibri" w:cs="Calibri"/>
+                <w:sz w:val="24"/>
+                <w:szCs w:val="24"/>
+              </w:rPr>
+              <w:t>.</w:t>
+            </w:r>
+          </w:p>
+        </w:tc>
+      </w:tr>
+      <w:tr>
+        <w:trPr>
+          <w:tblCellSpacing w:w="15" w:type="dxa"/>
+        </w:trPr>
+        <w:tc>
+          <w:tcPr>
+            <w:tcW w:w="0" w:type="auto"/>
+            <w:tcBorders>
+              <w:top w:val="single" w:sz="6" w:space="0" w:color="auto"/>
+              <w:left w:val="single" w:sz="6" w:space="0" w:color="auto"/>
+              <w:bottom w:val="single" w:sz="6" w:space="0" w:color="auto"/>
+              <w:right w:val="single" w:sz="6" w:space="0" w:color="auto"/>
+            </w:tcBorders>
+            <w:vAlign w:val="center"/>
+            <w:hideMark/>
+          </w:tcPr>
+          <w:p>
+            <w:pPr>
+              <w:rPr>
+                <w:rFonts w:ascii="Calibri" w:hAnsi="Calibri" w:cs="Calibri"/>
+                <w:sz w:val="24"/>
+                <w:szCs w:val="24"/>
+              </w:rPr>
+            </w:pPr>
+            <w:r>
+              <w:rPr>
+                <w:rFonts w:ascii="Calibri" w:hAnsi="Calibri" w:cs="Calibri"/>
+                <w:sz w:val="24"/>
+                <w:szCs w:val="24"/>
+              </w:rPr>
+              <w:t>node server.js</w:t>
+            </w:r>
+          </w:p>
+        </w:tc>
+        <w:tc>
+          <w:tcPr>
+            <w:tcW w:w="0" w:type="auto"/>
+            <w:tcBorders>
+              <w:top w:val="single" w:sz="6" w:space="0" w:color="auto"/>
+              <w:left w:val="single" w:sz="6" w:space="0" w:color="auto"/>
+              <w:bottom w:val="single" w:sz="6" w:space="0" w:color="auto"/>
+              <w:right w:val="single" w:sz="6" w:space="0" w:color="auto"/>
+            </w:tcBorders>
+            <w:vAlign w:val="center"/>
+            <w:hideMark/>
+          </w:tcPr>
+          <w:p>
+            <w:pPr>
+              <w:rPr>
+                <w:rFonts w:ascii="Calibri" w:hAnsi="Calibri" w:cs="Calibri"/>
+                <w:sz w:val="24"/>
+                <w:szCs w:val="24"/>
+              </w:rPr>
+            </w:pPr>
+            <w:proofErr w:type="spellStart"/>
+            <w:r>
+              <w:rPr>
+                <w:rFonts w:ascii="Calibri" w:hAnsi="Calibri" w:cs="Calibri"/>
+                <w:sz w:val="24"/>
+                <w:szCs w:val="24"/>
+              </w:rPr>
+              <w:t>Backend</w:t>
+            </w:r>
+            <w:proofErr w:type="spellEnd"/>
+            <w:r>
+              <w:rPr>
+                <w:rFonts w:ascii="Calibri" w:hAnsi="Calibri" w:cs="Calibri"/>
+                <w:sz w:val="24"/>
+                <w:szCs w:val="24"/>
+              </w:rPr>
+              <w:t xml:space="preserve"> (Node.js/API)</w:t>
+            </w:r>
+          </w:p>
+        </w:tc>
+        <w:tc>
+          <w:tcPr>
+            <w:tcW w:w="0" w:type="auto"/>
+            <w:tcBorders>
+              <w:top w:val="single" w:sz="6" w:space="0" w:color="auto"/>
+              <w:left w:val="single" w:sz="6" w:space="0" w:color="auto"/>
+              <w:bottom w:val="single" w:sz="6" w:space="0" w:color="auto"/>
+              <w:right w:val="single" w:sz="6" w:space="0" w:color="auto"/>
+            </w:tcBorders>
+            <w:vAlign w:val="center"/>
+            <w:hideMark/>
+          </w:tcPr>
+          <w:p>
+            <w:pPr>
+              <w:rPr>
+                <w:rFonts w:ascii="Calibri" w:hAnsi="Calibri" w:cs="Calibri"/>
+                <w:sz w:val="24"/>
+                <w:szCs w:val="24"/>
+              </w:rPr>
+            </w:pPr>
+            <w:r>
+              <w:rPr>
+                <w:rFonts w:ascii="Calibri" w:hAnsi="Calibri" w:cs="Calibri"/>
+                <w:sz w:val="24"/>
+                <w:szCs w:val="24"/>
+              </w:rPr>
+              <w:t>O processamento dos dados, salvamento no banco e envio de e-mails.</w:t>
+            </w:r>
+          </w:p>
+        </w:tc>
+      </w:tr>
+    </w:tbl>
+    <w:p>
+      <w:pPr>
+        <w:rPr>
+          <w:rFonts w:ascii="Calibri" w:hAnsi="Calibri" w:cs="Calibri"/>
+          <w:sz w:val="24"/>
+          <w:szCs w:val="24"/>
+        </w:rPr>
+      </w:pPr>
+      <w:r>
+        <w:rPr>
+          <w:rFonts w:ascii="Calibri" w:hAnsi="Calibri" w:cs="Calibri"/>
+          <w:sz w:val="24"/>
+          <w:szCs w:val="24"/>
+        </w:rPr>
+        <w:t>Dica técnica: Para o sistema funcionar completamente no seu computador, você precisa abrir dois terminais no VS Code e deixar os dois comandos rodando ao mesmo tempo.</w:t>
+      </w:r>
+    </w:p>
+    <w:p>
+      <w:pPr>
+        <w:rPr>
+          <w:rFonts w:ascii="Calibri" w:hAnsi="Calibri" w:cs="Calibri"/>
+          <w:sz w:val="24"/>
+          <w:szCs w:val="24"/>
+        </w:rPr>
+      </w:pPr>
+    </w:p>
+    <w:p>
+      <w:pPr>
+        <w:rPr>
+          <w:rFonts w:ascii="Calibri" w:hAnsi="Calibri" w:cs="Calibri"/>
+          <w:sz w:val="24"/>
+          <w:szCs w:val="24"/>
+        </w:rPr>
+      </w:pPr>
+      <w:r>
+        <w:rPr>
+          <w:rFonts w:ascii="Calibri" w:hAnsi="Calibri" w:cs="Calibri"/>
           <w:noProof/>
+          <w:sz w:val="24"/>
+          <w:szCs w:val="24"/>
         </w:rPr>
         <w:drawing>
           <wp:inline distT="0" distB="0" distL="0" distR="0" wp14:anchorId="37E79C18" wp14:editId="4B5C0D06">
@@ -54,31 +1148,50 @@
     <w:p>
       <w:pPr>
         <w:rPr>
+          <w:rFonts w:ascii="Calibri" w:hAnsi="Calibri" w:cs="Calibri"/>
+          <w:sz w:val="24"/>
+          <w:szCs w:val="24"/>
+        </w:rPr>
+      </w:pPr>
+    </w:p>
+    <w:p>
+      <w:pPr>
+        <w:rPr>
+          <w:rFonts w:ascii="Calibri" w:hAnsi="Calibri" w:cs="Calibri"/>
+          <w:sz w:val="24"/>
+          <w:szCs w:val="24"/>
+        </w:rPr>
+      </w:pPr>
+      <w:r>
+        <w:rPr>
+          <w:rFonts w:ascii="Calibri" w:hAnsi="Calibri" w:cs="Calibri"/>
+          <w:sz w:val="24"/>
+          <w:szCs w:val="24"/>
+        </w:rPr>
+        <w:t>Para abrir um sistema abra o terminal da IDE e digitem node sever.js</w:t>
+      </w:r>
+    </w:p>
+    <w:p>
+      <w:pPr>
+        <w:rPr>
+          <w:rFonts w:ascii="Calibri" w:hAnsi="Calibri" w:cs="Calibri"/>
+          <w:sz w:val="24"/>
+          <w:szCs w:val="24"/>
+        </w:rPr>
+      </w:pPr>
+      <w:r>
+        <w:rPr>
           <w:rFonts w:ascii="Segoe UI Emoji" w:hAnsi="Segoe UI Emoji" w:cs="Segoe UI Emoji"/>
-          <w:b/>
-          <w:bCs/>
-        </w:rPr>
-      </w:pPr>
-    </w:p>
-    <w:p>
-      <w:pPr>
-        <w:rPr>
-          <w:b/>
-          <w:bCs/>
-        </w:rPr>
-      </w:pPr>
-      <w:r>
-        <w:rPr>
-          <w:rFonts w:ascii="Segoe UI Emoji" w:hAnsi="Segoe UI Emoji" w:cs="Segoe UI Emoji"/>
-          <w:b/>
-          <w:bCs/>
+          <w:sz w:val="24"/>
+          <w:szCs w:val="24"/>
         </w:rPr>
         <w:t>📂</w:t>
       </w:r>
       <w:r>
         <w:rPr>
-          <w:b/>
-          <w:bCs/>
+          <w:rFonts w:ascii="Calibri" w:hAnsi="Calibri" w:cs="Calibri"/>
+          <w:sz w:val="24"/>
+          <w:szCs w:val="24"/>
         </w:rPr>
         <w:t xml:space="preserve"> Estrutura de Pastas</w:t>
       </w:r>
@@ -89,42 +1202,38 @@
           <w:ilvl w:val="0"/>
           <w:numId w:val="1"/>
         </w:numPr>
-      </w:pPr>
-      <w:r>
-        <w:rPr>
-          <w:b/>
-          <w:bCs/>
-        </w:rPr>
-        <w:t>components</w:t>
-      </w:r>
-      <w:r>
-        <w:t>: Contém as peças visuais reutilizáveis da sua interface</w:t>
-      </w:r>
-      <w:r>
-        <w:t>, é</w:t>
-      </w:r>
-      <w:r>
-        <w:t xml:space="preserve"> o coração da organização do seu </w:t>
-      </w:r>
-      <w:r>
-        <w:rPr>
-          <w:b/>
-          <w:bCs/>
-        </w:rPr>
-        <w:t>React</w:t>
-      </w:r>
-      <w:r>
-        <w:t>,</w:t>
-      </w:r>
-      <w:r>
-        <w:t xml:space="preserve"> são eles:</w:t>
+        <w:rPr>
+          <w:rFonts w:ascii="Calibri" w:hAnsi="Calibri" w:cs="Calibri"/>
+          <w:sz w:val="24"/>
+          <w:szCs w:val="24"/>
+        </w:rPr>
+      </w:pPr>
+      <w:r>
+        <w:rPr>
+          <w:rFonts w:ascii="Calibri" w:hAnsi="Calibri" w:cs="Calibri"/>
+          <w:sz w:val="24"/>
+          <w:szCs w:val="24"/>
+        </w:rPr>
+        <w:t>components: Contém as peças visuais reutilizáveis da sua interface, é o coração da organização do seu React, são eles:</w:t>
       </w:r>
     </w:p>
     <w:p>
       <w:pPr>
         <w:ind w:left="720"/>
-      </w:pPr>
-      <w:r>
+        <w:rPr>
+          <w:rFonts w:ascii="Calibri" w:hAnsi="Calibri" w:cs="Calibri"/>
+          <w:sz w:val="24"/>
+          <w:szCs w:val="24"/>
+        </w:rPr>
+      </w:pPr>
+      <w:r>
+        <w:rPr>
+          <w:rFonts w:ascii="Calibri" w:hAnsi="Calibri" w:cs="Calibri"/>
+          <w:noProof/>
+          <w:sz w:val="24"/>
+          <w:szCs w:val="24"/>
+        </w:rPr>
+        <w:lastRenderedPageBreak/>
         <w:drawing>
           <wp:inline distT="0" distB="0" distL="0" distR="0" wp14:anchorId="25008786" wp14:editId="205BEB9F">
             <wp:extent cx="2591162" cy="1476581"/>
@@ -162,26 +1271,38 @@
         </w:drawing>
       </w:r>
       <w:r>
+        <w:rPr>
+          <w:rFonts w:ascii="Calibri" w:hAnsi="Calibri" w:cs="Calibri"/>
+          <w:sz w:val="24"/>
+          <w:szCs w:val="24"/>
+        </w:rPr>
         <w:t xml:space="preserve"> </w:t>
       </w:r>
     </w:p>
     <w:p>
       <w:pPr>
         <w:ind w:left="720"/>
+        <w:rPr>
+          <w:rFonts w:ascii="Calibri" w:hAnsi="Calibri" w:cs="Calibri"/>
+          <w:sz w:val="24"/>
+          <w:szCs w:val="24"/>
+        </w:rPr>
       </w:pPr>
       <w:proofErr w:type="spellStart"/>
       <w:r>
         <w:rPr>
-          <w:b/>
-          <w:bCs/>
+          <w:rFonts w:ascii="Calibri" w:hAnsi="Calibri" w:cs="Calibri"/>
+          <w:sz w:val="24"/>
+          <w:szCs w:val="24"/>
         </w:rPr>
         <w:t>AuthPage.tsx</w:t>
       </w:r>
       <w:proofErr w:type="spellEnd"/>
       <w:r>
         <w:rPr>
-          <w:b/>
-          <w:bCs/>
+          <w:rFonts w:ascii="Calibri" w:hAnsi="Calibri" w:cs="Calibri"/>
+          <w:sz w:val="24"/>
+          <w:szCs w:val="24"/>
         </w:rPr>
         <w:t>:</w:t>
       </w:r>
@@ -189,79 +1310,99 @@
     <w:p>
       <w:pPr>
         <w:ind w:left="720"/>
-      </w:pPr>
-      <w:r>
-        <w:t>Gerencia o login, cadastro e recuperação de acesso</w:t>
-      </w:r>
-      <w:r>
-        <w:t>.</w:t>
+        <w:rPr>
+          <w:rFonts w:ascii="Calibri" w:hAnsi="Calibri" w:cs="Calibri"/>
+          <w:sz w:val="24"/>
+          <w:szCs w:val="24"/>
+        </w:rPr>
+      </w:pPr>
+      <w:r>
+        <w:rPr>
+          <w:rFonts w:ascii="Calibri" w:hAnsi="Calibri" w:cs="Calibri"/>
+          <w:sz w:val="24"/>
+          <w:szCs w:val="24"/>
+        </w:rPr>
+        <w:t>Gerencia o login, cadastro e recuperação de acesso.</w:t>
       </w:r>
     </w:p>
     <w:p>
       <w:pPr>
         <w:ind w:left="720"/>
+        <w:rPr>
+          <w:rFonts w:ascii="Calibri" w:hAnsi="Calibri" w:cs="Calibri"/>
+          <w:sz w:val="24"/>
+          <w:szCs w:val="24"/>
+        </w:rPr>
       </w:pPr>
       <w:proofErr w:type="spellStart"/>
       <w:r>
         <w:rPr>
-          <w:b/>
-          <w:bCs/>
+          <w:rFonts w:ascii="Calibri" w:hAnsi="Calibri" w:cs="Calibri"/>
+          <w:sz w:val="24"/>
+          <w:szCs w:val="24"/>
         </w:rPr>
         <w:t>Dashboard.tsx</w:t>
       </w:r>
       <w:proofErr w:type="spellEnd"/>
       <w:r>
         <w:rPr>
-          <w:b/>
-          <w:bCs/>
+          <w:rFonts w:ascii="Calibri" w:hAnsi="Calibri" w:cs="Calibri"/>
+          <w:sz w:val="24"/>
+          <w:szCs w:val="24"/>
         </w:rPr>
         <w:t xml:space="preserve">, </w:t>
       </w:r>
       <w:proofErr w:type="spellStart"/>
       <w:r>
         <w:rPr>
-          <w:b/>
-          <w:bCs/>
+          <w:rFonts w:ascii="Calibri" w:hAnsi="Calibri" w:cs="Calibri"/>
+          <w:sz w:val="24"/>
+          <w:szCs w:val="24"/>
         </w:rPr>
         <w:t>Logistics.tsx</w:t>
       </w:r>
       <w:proofErr w:type="spellEnd"/>
       <w:r>
         <w:rPr>
-          <w:b/>
-          <w:bCs/>
+          <w:rFonts w:ascii="Calibri" w:hAnsi="Calibri" w:cs="Calibri"/>
+          <w:sz w:val="24"/>
+          <w:szCs w:val="24"/>
         </w:rPr>
         <w:t xml:space="preserve">, </w:t>
       </w:r>
       <w:proofErr w:type="spellStart"/>
       <w:r>
         <w:rPr>
-          <w:b/>
-          <w:bCs/>
+          <w:rFonts w:ascii="Calibri" w:hAnsi="Calibri" w:cs="Calibri"/>
+          <w:sz w:val="24"/>
+          <w:szCs w:val="24"/>
         </w:rPr>
         <w:t>Marketplace.tsx</w:t>
       </w:r>
       <w:proofErr w:type="spellEnd"/>
       <w:r>
         <w:rPr>
-          <w:b/>
-          <w:bCs/>
+          <w:rFonts w:ascii="Calibri" w:hAnsi="Calibri" w:cs="Calibri"/>
+          <w:sz w:val="24"/>
+          <w:szCs w:val="24"/>
         </w:rPr>
         <w:t xml:space="preserve">, </w:t>
       </w:r>
       <w:proofErr w:type="spellStart"/>
       <w:r>
         <w:rPr>
-          <w:b/>
-          <w:bCs/>
+          <w:rFonts w:ascii="Calibri" w:hAnsi="Calibri" w:cs="Calibri"/>
+          <w:sz w:val="24"/>
+          <w:szCs w:val="24"/>
         </w:rPr>
         <w:t>Services.tsx</w:t>
       </w:r>
       <w:proofErr w:type="spellEnd"/>
       <w:r>
         <w:rPr>
-          <w:b/>
-          <w:bCs/>
+          <w:rFonts w:ascii="Calibri" w:hAnsi="Calibri" w:cs="Calibri"/>
+          <w:sz w:val="24"/>
+          <w:szCs w:val="24"/>
         </w:rPr>
         <w:t>:</w:t>
       </w:r>
@@ -269,19 +1410,39 @@
     <w:p>
       <w:pPr>
         <w:ind w:left="720"/>
-      </w:pPr>
-      <w:r>
+        <w:rPr>
+          <w:rFonts w:ascii="Calibri" w:hAnsi="Calibri" w:cs="Calibri"/>
+          <w:sz w:val="24"/>
+          <w:szCs w:val="24"/>
+        </w:rPr>
+      </w:pPr>
+      <w:r>
+        <w:rPr>
+          <w:rFonts w:ascii="Calibri" w:hAnsi="Calibri" w:cs="Calibri"/>
+          <w:sz w:val="24"/>
+          <w:szCs w:val="24"/>
+        </w:rPr>
         <w:t>Telas que compõem o painel principal do sistema.</w:t>
       </w:r>
     </w:p>
     <w:p>
       <w:pPr>
         <w:ind w:left="720"/>
+        <w:rPr>
+          <w:rFonts w:ascii="Calibri" w:hAnsi="Calibri" w:cs="Calibri"/>
+          <w:sz w:val="24"/>
+          <w:szCs w:val="24"/>
+        </w:rPr>
       </w:pPr>
     </w:p>
     <w:p>
       <w:pPr>
         <w:ind w:left="720"/>
+        <w:rPr>
+          <w:rFonts w:ascii="Calibri" w:hAnsi="Calibri" w:cs="Calibri"/>
+          <w:sz w:val="24"/>
+          <w:szCs w:val="24"/>
+        </w:rPr>
       </w:pPr>
     </w:p>
     <w:p>
@@ -290,29 +1451,38 @@
           <w:ilvl w:val="0"/>
           <w:numId w:val="1"/>
         </w:numPr>
+        <w:rPr>
+          <w:rFonts w:ascii="Calibri" w:hAnsi="Calibri" w:cs="Calibri"/>
+          <w:sz w:val="24"/>
+          <w:szCs w:val="24"/>
+        </w:rPr>
       </w:pPr>
       <w:proofErr w:type="spellStart"/>
       <w:proofErr w:type="gramStart"/>
       <w:r>
         <w:rPr>
-          <w:b/>
-          <w:bCs/>
+          <w:rFonts w:ascii="Calibri" w:hAnsi="Calibri" w:cs="Calibri"/>
+          <w:sz w:val="24"/>
+          <w:szCs w:val="24"/>
         </w:rPr>
         <w:t>lib</w:t>
       </w:r>
       <w:proofErr w:type="spellEnd"/>
       <w:r>
         <w:rPr>
-          <w:b/>
-          <w:bCs/>
-        </w:rPr>
-        <w:t>/</w:t>
-      </w:r>
-      <w:r>
-        <w:t>: Geralmente</w:t>
+          <w:rFonts w:ascii="Calibri" w:hAnsi="Calibri" w:cs="Calibri"/>
+          <w:sz w:val="24"/>
+          <w:szCs w:val="24"/>
+        </w:rPr>
+        <w:t>/: Geralmente</w:t>
       </w:r>
       <w:proofErr w:type="gramEnd"/>
       <w:r>
+        <w:rPr>
+          <w:rFonts w:ascii="Calibri" w:hAnsi="Calibri" w:cs="Calibri"/>
+          <w:sz w:val="24"/>
+          <w:szCs w:val="24"/>
+        </w:rPr>
         <w:t xml:space="preserve"> usada para arquivos de configuração de bibliotecas externas ou funções utilitárias que são compartilhadas por todo o sistema.</w:t>
       </w:r>
     </w:p>
@@ -322,57 +1492,92 @@
           <w:ilvl w:val="0"/>
           <w:numId w:val="1"/>
         </w:numPr>
+        <w:rPr>
+          <w:rFonts w:ascii="Calibri" w:hAnsi="Calibri" w:cs="Calibri"/>
+          <w:sz w:val="24"/>
+          <w:szCs w:val="24"/>
+        </w:rPr>
       </w:pPr>
       <w:proofErr w:type="spellStart"/>
       <w:r>
         <w:rPr>
-          <w:b/>
-          <w:bCs/>
+          <w:rFonts w:ascii="Calibri" w:hAnsi="Calibri" w:cs="Calibri"/>
+          <w:sz w:val="24"/>
+          <w:szCs w:val="24"/>
         </w:rPr>
         <w:t>node_</w:t>
       </w:r>
       <w:proofErr w:type="gramStart"/>
       <w:r>
         <w:rPr>
-          <w:b/>
-          <w:bCs/>
+          <w:rFonts w:ascii="Calibri" w:hAnsi="Calibri" w:cs="Calibri"/>
+          <w:sz w:val="24"/>
+          <w:szCs w:val="24"/>
         </w:rPr>
         <w:t>modules</w:t>
       </w:r>
       <w:proofErr w:type="spellEnd"/>
       <w:r>
         <w:rPr>
-          <w:b/>
-          <w:bCs/>
-        </w:rPr>
-        <w:t>/</w:t>
-      </w:r>
-      <w:r>
-        <w:t>: Esta</w:t>
+          <w:rFonts w:ascii="Calibri" w:hAnsi="Calibri" w:cs="Calibri"/>
+          <w:sz w:val="24"/>
+          <w:szCs w:val="24"/>
+        </w:rPr>
+        <w:t>/: Esta</w:t>
       </w:r>
       <w:proofErr w:type="gramEnd"/>
       <w:r>
+        <w:rPr>
+          <w:rFonts w:ascii="Calibri" w:hAnsi="Calibri" w:cs="Calibri"/>
+          <w:sz w:val="24"/>
+          <w:szCs w:val="24"/>
+        </w:rPr>
         <w:t xml:space="preserve"> pasta guarda todas as bibliotecas que você instalou via </w:t>
       </w:r>
       <w:proofErr w:type="spellStart"/>
       <w:r>
+        <w:rPr>
+          <w:rFonts w:ascii="Calibri" w:hAnsi="Calibri" w:cs="Calibri"/>
+          <w:sz w:val="24"/>
+          <w:szCs w:val="24"/>
+        </w:rPr>
         <w:t>npm</w:t>
       </w:r>
       <w:proofErr w:type="spellEnd"/>
       <w:r>
+        <w:rPr>
+          <w:rFonts w:ascii="Calibri" w:hAnsi="Calibri" w:cs="Calibri"/>
+          <w:sz w:val="24"/>
+          <w:szCs w:val="24"/>
+        </w:rPr>
         <w:t xml:space="preserve"> (como Express, React e Lucide). Ela é pesada e, por isso, está listada no </w:t>
       </w:r>
       <w:proofErr w:type="gramStart"/>
       <w:r>
+        <w:rPr>
+          <w:rFonts w:ascii="Calibri" w:hAnsi="Calibri" w:cs="Calibri"/>
+          <w:sz w:val="24"/>
+          <w:szCs w:val="24"/>
+        </w:rPr>
         <w:t>seu .</w:t>
       </w:r>
       <w:proofErr w:type="spellStart"/>
       <w:r>
+        <w:rPr>
+          <w:rFonts w:ascii="Calibri" w:hAnsi="Calibri" w:cs="Calibri"/>
+          <w:sz w:val="24"/>
+          <w:szCs w:val="24"/>
+        </w:rPr>
         <w:t>gitignore</w:t>
       </w:r>
       <w:proofErr w:type="spellEnd"/>
       <w:proofErr w:type="gramEnd"/>
       <w:r>
+        <w:rPr>
+          <w:rFonts w:ascii="Calibri" w:hAnsi="Calibri" w:cs="Calibri"/>
+          <w:sz w:val="24"/>
+          <w:szCs w:val="24"/>
+        </w:rPr>
         <w:t xml:space="preserve"> para não subir ao GitHub.</w:t>
       </w:r>
     </w:p>
@@ -382,29 +1587,38 @@
           <w:ilvl w:val="0"/>
           <w:numId w:val="1"/>
         </w:numPr>
+        <w:rPr>
+          <w:rFonts w:ascii="Calibri" w:hAnsi="Calibri" w:cs="Calibri"/>
+          <w:sz w:val="24"/>
+          <w:szCs w:val="24"/>
+        </w:rPr>
       </w:pPr>
       <w:proofErr w:type="spellStart"/>
       <w:proofErr w:type="gramStart"/>
       <w:r>
         <w:rPr>
-          <w:b/>
-          <w:bCs/>
+          <w:rFonts w:ascii="Calibri" w:hAnsi="Calibri" w:cs="Calibri"/>
+          <w:sz w:val="24"/>
+          <w:szCs w:val="24"/>
         </w:rPr>
         <w:t>public</w:t>
       </w:r>
       <w:proofErr w:type="spellEnd"/>
       <w:r>
         <w:rPr>
-          <w:b/>
-          <w:bCs/>
-        </w:rPr>
-        <w:t>/</w:t>
-      </w:r>
-      <w:r>
-        <w:t>: Local</w:t>
+          <w:rFonts w:ascii="Calibri" w:hAnsi="Calibri" w:cs="Calibri"/>
+          <w:sz w:val="24"/>
+          <w:szCs w:val="24"/>
+        </w:rPr>
+        <w:t>/: Local</w:t>
       </w:r>
       <w:proofErr w:type="gramEnd"/>
       <w:r>
+        <w:rPr>
+          <w:rFonts w:ascii="Calibri" w:hAnsi="Calibri" w:cs="Calibri"/>
+          <w:sz w:val="24"/>
+          <w:szCs w:val="24"/>
+        </w:rPr>
         <w:t xml:space="preserve"> onde ficam arquivos estáticos que não mudam, como o ícone do sistema (favicon) e a imagem tecnológica que geramos para o painel.</w:t>
       </w:r>
     </w:p>
@@ -414,52 +1628,79 @@
           <w:ilvl w:val="0"/>
           <w:numId w:val="1"/>
         </w:numPr>
-      </w:pPr>
-      <w:r>
-        <w:rPr>
-          <w:b/>
-          <w:bCs/>
-        </w:rPr>
-        <w:t>services/</w:t>
-      </w:r>
-      <w:r>
-        <w:t xml:space="preserve">: Pasta destinada a arquivos que lidam com lógica de comunicação externa, como as chamadas para a sua API no </w:t>
+        <w:rPr>
+          <w:rFonts w:ascii="Calibri" w:hAnsi="Calibri" w:cs="Calibri"/>
+          <w:sz w:val="24"/>
+          <w:szCs w:val="24"/>
+        </w:rPr>
+      </w:pPr>
+      <w:r>
+        <w:rPr>
+          <w:rFonts w:ascii="Calibri" w:hAnsi="Calibri" w:cs="Calibri"/>
+          <w:sz w:val="24"/>
+          <w:szCs w:val="24"/>
+        </w:rPr>
+        <w:t xml:space="preserve">services/: Pasta destinada a arquivos que lidam com lógica de comunicação externa, como as chamadas para a sua API no </w:t>
       </w:r>
       <w:proofErr w:type="spellStart"/>
       <w:r>
+        <w:rPr>
+          <w:rFonts w:ascii="Calibri" w:hAnsi="Calibri" w:cs="Calibri"/>
+          <w:sz w:val="24"/>
+          <w:szCs w:val="24"/>
+        </w:rPr>
         <w:t>backend</w:t>
       </w:r>
       <w:proofErr w:type="spellEnd"/>
       <w:r>
+        <w:rPr>
+          <w:rFonts w:ascii="Calibri" w:hAnsi="Calibri" w:cs="Calibri"/>
+          <w:sz w:val="24"/>
+          <w:szCs w:val="24"/>
+        </w:rPr>
         <w:t>.</w:t>
       </w:r>
     </w:p>
     <w:p>
-      <w:r>
+      <w:pPr>
+        <w:rPr>
+          <w:rFonts w:ascii="Calibri" w:hAnsi="Calibri" w:cs="Calibri"/>
+          <w:sz w:val="24"/>
+          <w:szCs w:val="24"/>
+        </w:rPr>
+      </w:pPr>
+      <w:r>
+        <w:rPr>
+          <w:rFonts w:ascii="Calibri" w:hAnsi="Calibri" w:cs="Calibri"/>
+          <w:sz w:val="24"/>
+          <w:szCs w:val="24"/>
+        </w:rPr>
         <w:pict w14:anchorId="136F7A00">
-          <v:rect id="_x0000_i1037" style="width:0;height:1.5pt" o:hralign="center" o:hrstd="t" o:hr="t" fillcolor="#a0a0a0" stroked="f"/>
+          <v:rect id="_x0000_i1026" style="width:0;height:1.5pt" o:hralign="center" o:hrstd="t" o:hr="t" fillcolor="#a0a0a0" stroked="f"/>
         </w:pict>
       </w:r>
     </w:p>
     <w:p>
       <w:pPr>
         <w:rPr>
-          <w:b/>
-          <w:bCs/>
+          <w:rFonts w:ascii="Calibri" w:hAnsi="Calibri" w:cs="Calibri"/>
+          <w:sz w:val="24"/>
+          <w:szCs w:val="24"/>
         </w:rPr>
       </w:pPr>
       <w:r>
         <w:rPr>
           <w:rFonts w:ascii="Segoe UI Emoji" w:hAnsi="Segoe UI Emoji" w:cs="Segoe UI Emoji"/>
-          <w:b/>
-          <w:bCs/>
+          <w:sz w:val="24"/>
+          <w:szCs w:val="24"/>
         </w:rPr>
         <w:t>📄</w:t>
       </w:r>
       <w:r>
         <w:rPr>
-          <w:b/>
-          <w:bCs/>
+          <w:rFonts w:ascii="Calibri" w:hAnsi="Calibri" w:cs="Calibri"/>
+          <w:sz w:val="24"/>
+          <w:szCs w:val="24"/>
         </w:rPr>
         <w:t xml:space="preserve"> Arquivos de Configuração e Ambiente</w:t>
       </w:r>
@@ -470,20 +1711,27 @@
           <w:ilvl w:val="0"/>
           <w:numId w:val="2"/>
         </w:numPr>
+        <w:rPr>
+          <w:rFonts w:ascii="Calibri" w:hAnsi="Calibri" w:cs="Calibri"/>
+          <w:sz w:val="24"/>
+          <w:szCs w:val="24"/>
+        </w:rPr>
       </w:pPr>
       <w:proofErr w:type="gramStart"/>
       <w:r>
         <w:rPr>
-          <w:b/>
-          <w:bCs/>
+          <w:rFonts w:ascii="Calibri" w:hAnsi="Calibri" w:cs="Calibri"/>
+          <w:sz w:val="24"/>
+          <w:szCs w:val="24"/>
         </w:rPr>
         <w:t>.</w:t>
       </w:r>
       <w:proofErr w:type="spellStart"/>
       <w:r>
         <w:rPr>
-          <w:b/>
-          <w:bCs/>
+          <w:rFonts w:ascii="Calibri" w:hAnsi="Calibri" w:cs="Calibri"/>
+          <w:sz w:val="24"/>
+          <w:szCs w:val="24"/>
         </w:rPr>
         <w:t>env</w:t>
       </w:r>
@@ -491,48 +1739,47 @@
       <w:proofErr w:type="gramEnd"/>
       <w:r>
         <w:rPr>
-          <w:b/>
-          <w:bCs/>
+          <w:rFonts w:ascii="Calibri" w:hAnsi="Calibri" w:cs="Calibri"/>
+          <w:sz w:val="24"/>
+          <w:szCs w:val="24"/>
         </w:rPr>
         <w:t xml:space="preserve"> </w:t>
       </w:r>
       <w:proofErr w:type="gramStart"/>
       <w:r>
         <w:rPr>
-          <w:b/>
-          <w:bCs/>
+          <w:rFonts w:ascii="Calibri" w:hAnsi="Calibri" w:cs="Calibri"/>
+          <w:sz w:val="24"/>
+          <w:szCs w:val="24"/>
         </w:rPr>
         <w:t>e .</w:t>
       </w:r>
       <w:proofErr w:type="spellStart"/>
       <w:r>
         <w:rPr>
-          <w:b/>
-          <w:bCs/>
+          <w:rFonts w:ascii="Calibri" w:hAnsi="Calibri" w:cs="Calibri"/>
+          <w:sz w:val="24"/>
+          <w:szCs w:val="24"/>
         </w:rPr>
         <w:t>env</w:t>
       </w:r>
       <w:proofErr w:type="gramEnd"/>
       <w:r>
         <w:rPr>
-          <w:b/>
-          <w:bCs/>
+          <w:rFonts w:ascii="Calibri" w:hAnsi="Calibri" w:cs="Calibri"/>
+          <w:sz w:val="24"/>
+          <w:szCs w:val="24"/>
         </w:rPr>
         <w:t>.local</w:t>
       </w:r>
       <w:proofErr w:type="spellEnd"/>
       <w:r>
-        <w:t xml:space="preserve">: Arquivos para guardar informações sensíveis (como sua </w:t>
-      </w:r>
-      <w:r>
-        <w:rPr>
-          <w:b/>
-          <w:bCs/>
-        </w:rPr>
-        <w:t>Senha de App de 16 dígitos</w:t>
-      </w:r>
-      <w:r>
-        <w:t>). Eles permitem que o código funcione sem expor suas senhas reais publicamente.</w:t>
+        <w:rPr>
+          <w:rFonts w:ascii="Calibri" w:hAnsi="Calibri" w:cs="Calibri"/>
+          <w:sz w:val="24"/>
+          <w:szCs w:val="24"/>
+        </w:rPr>
+        <w:t>: Arquivos para guardar informações sensíveis (como sua Senha de App de 16 dígitos). Eles permitem que o código funcione sem expor suas senhas reais publicamente.</w:t>
       </w:r>
     </w:p>
     <w:p>
@@ -541,42 +1788,56 @@
           <w:ilvl w:val="0"/>
           <w:numId w:val="2"/>
         </w:numPr>
+        <w:rPr>
+          <w:rFonts w:ascii="Calibri" w:hAnsi="Calibri" w:cs="Calibri"/>
+          <w:sz w:val="24"/>
+          <w:szCs w:val="24"/>
+        </w:rPr>
       </w:pPr>
       <w:proofErr w:type="gramStart"/>
       <w:r>
         <w:rPr>
-          <w:b/>
-          <w:bCs/>
+          <w:rFonts w:ascii="Calibri" w:hAnsi="Calibri" w:cs="Calibri"/>
+          <w:sz w:val="24"/>
+          <w:szCs w:val="24"/>
         </w:rPr>
         <w:t>.</w:t>
       </w:r>
       <w:proofErr w:type="spellStart"/>
       <w:r>
         <w:rPr>
-          <w:b/>
-          <w:bCs/>
+          <w:rFonts w:ascii="Calibri" w:hAnsi="Calibri" w:cs="Calibri"/>
+          <w:sz w:val="24"/>
+          <w:szCs w:val="24"/>
         </w:rPr>
         <w:t>gitignore</w:t>
       </w:r>
       <w:proofErr w:type="spellEnd"/>
       <w:proofErr w:type="gramEnd"/>
       <w:r>
-        <w:t xml:space="preserve">: Um arquivo de texto que diz ao Git quais pastas e arquivos ele deve ignorar. No seu caso, ele protege o </w:t>
+        <w:rPr>
+          <w:rFonts w:ascii="Calibri" w:hAnsi="Calibri" w:cs="Calibri"/>
+          <w:sz w:val="24"/>
+          <w:szCs w:val="24"/>
+        </w:rPr>
+        <w:t xml:space="preserve">: Um arquivo de texto que diz ao Git quais pastas e arquivos ele deve ignorar. No seu caso, ele protege o database.db e a </w:t>
       </w:r>
       <w:proofErr w:type="spellStart"/>
       <w:r>
-        <w:t>database.db</w:t>
+        <w:rPr>
+          <w:rFonts w:ascii="Calibri" w:hAnsi="Calibri" w:cs="Calibri"/>
+          <w:sz w:val="24"/>
+          <w:szCs w:val="24"/>
+        </w:rPr>
+        <w:t>node_modules</w:t>
       </w:r>
       <w:proofErr w:type="spellEnd"/>
       <w:r>
-        <w:t xml:space="preserve"> e a </w:t>
-      </w:r>
-      <w:proofErr w:type="spellStart"/>
-      <w:r>
-        <w:t>node_modules</w:t>
-      </w:r>
-      <w:proofErr w:type="spellEnd"/>
-      <w:r>
+        <w:rPr>
+          <w:rFonts w:ascii="Calibri" w:hAnsi="Calibri" w:cs="Calibri"/>
+          <w:sz w:val="24"/>
+          <w:szCs w:val="24"/>
+        </w:rPr>
         <w:t>.</w:t>
       </w:r>
     </w:p>
@@ -586,13 +1847,19 @@
           <w:ilvl w:val="0"/>
           <w:numId w:val="2"/>
         </w:numPr>
+        <w:rPr>
+          <w:rFonts w:ascii="Calibri" w:hAnsi="Calibri" w:cs="Calibri"/>
+          <w:sz w:val="24"/>
+          <w:szCs w:val="24"/>
+        </w:rPr>
       </w:pPr>
       <w:proofErr w:type="spellStart"/>
       <w:proofErr w:type="gramStart"/>
       <w:r>
         <w:rPr>
-          <w:b/>
-          <w:bCs/>
+          <w:rFonts w:ascii="Calibri" w:hAnsi="Calibri" w:cs="Calibri"/>
+          <w:sz w:val="24"/>
+          <w:szCs w:val="24"/>
         </w:rPr>
         <w:t>package.json</w:t>
       </w:r>
@@ -600,30 +1867,38 @@
       <w:proofErr w:type="gramEnd"/>
       <w:r>
         <w:rPr>
-          <w:b/>
-          <w:bCs/>
+          <w:rFonts w:ascii="Calibri" w:hAnsi="Calibri" w:cs="Calibri"/>
+          <w:sz w:val="24"/>
+          <w:szCs w:val="24"/>
         </w:rPr>
         <w:t xml:space="preserve"> e </w:t>
       </w:r>
       <w:proofErr w:type="spellStart"/>
       <w:r>
         <w:rPr>
-          <w:b/>
-          <w:bCs/>
+          <w:rFonts w:ascii="Calibri" w:hAnsi="Calibri" w:cs="Calibri"/>
+          <w:sz w:val="24"/>
+          <w:szCs w:val="24"/>
         </w:rPr>
         <w:t>package-</w:t>
       </w:r>
       <w:proofErr w:type="gramStart"/>
       <w:r>
         <w:rPr>
-          <w:b/>
-          <w:bCs/>
+          <w:rFonts w:ascii="Calibri" w:hAnsi="Calibri" w:cs="Calibri"/>
+          <w:sz w:val="24"/>
+          <w:szCs w:val="24"/>
         </w:rPr>
         <w:t>lock.json</w:t>
       </w:r>
       <w:proofErr w:type="spellEnd"/>
       <w:proofErr w:type="gramEnd"/>
       <w:r>
+        <w:rPr>
+          <w:rFonts w:ascii="Calibri" w:hAnsi="Calibri" w:cs="Calibri"/>
+          <w:sz w:val="24"/>
+          <w:szCs w:val="24"/>
+        </w:rPr>
         <w:t>: Funcionam como o "inventário" do seu projeto. Eles listam o nome do sistema, a versão e todas as dependências necessárias para ele rodar.</w:t>
       </w:r>
     </w:p>
@@ -633,30 +1908,31 @@
           <w:ilvl w:val="0"/>
           <w:numId w:val="2"/>
         </w:numPr>
+        <w:rPr>
+          <w:rFonts w:ascii="Calibri" w:hAnsi="Calibri" w:cs="Calibri"/>
+          <w:sz w:val="24"/>
+          <w:szCs w:val="24"/>
+        </w:rPr>
       </w:pPr>
       <w:proofErr w:type="spellStart"/>
       <w:proofErr w:type="gramStart"/>
       <w:r>
         <w:rPr>
-          <w:b/>
-          <w:bCs/>
+          <w:rFonts w:ascii="Calibri" w:hAnsi="Calibri" w:cs="Calibri"/>
+          <w:sz w:val="24"/>
+          <w:szCs w:val="24"/>
         </w:rPr>
         <w:t>tsconfig.json</w:t>
       </w:r>
       <w:proofErr w:type="spellEnd"/>
       <w:proofErr w:type="gramEnd"/>
       <w:r>
-        <w:t xml:space="preserve">: Arquivo de configuração do </w:t>
-      </w:r>
-      <w:r>
-        <w:rPr>
-          <w:b/>
-          <w:bCs/>
-        </w:rPr>
-        <w:t>TypeScript</w:t>
-      </w:r>
-      <w:r>
-        <w:t>, que define as regras de como o seu código deve ser compilado e verificado.</w:t>
+        <w:rPr>
+          <w:rFonts w:ascii="Calibri" w:hAnsi="Calibri" w:cs="Calibri"/>
+          <w:sz w:val="24"/>
+          <w:szCs w:val="24"/>
+        </w:rPr>
+        <w:t>: Arquivo de configuração do TypeScript, que define as regras de como o seu código deve ser compilado e verificado.</w:t>
       </w:r>
     </w:p>
     <w:p>
@@ -665,64 +1941,90 @@
           <w:ilvl w:val="0"/>
           <w:numId w:val="2"/>
         </w:numPr>
+        <w:rPr>
+          <w:rFonts w:ascii="Calibri" w:hAnsi="Calibri" w:cs="Calibri"/>
+          <w:sz w:val="24"/>
+          <w:szCs w:val="24"/>
+        </w:rPr>
       </w:pPr>
       <w:proofErr w:type="spellStart"/>
       <w:r>
         <w:rPr>
-          <w:b/>
-          <w:bCs/>
-        </w:rPr>
+          <w:rFonts w:ascii="Calibri" w:hAnsi="Calibri" w:cs="Calibri"/>
+          <w:sz w:val="24"/>
+          <w:szCs w:val="24"/>
+        </w:rPr>
+        <w:lastRenderedPageBreak/>
         <w:t>vite.config.ts</w:t>
       </w:r>
       <w:proofErr w:type="spellEnd"/>
       <w:r>
-        <w:t xml:space="preserve">: Configurações do </w:t>
-      </w:r>
-      <w:r>
-        <w:rPr>
-          <w:b/>
-          <w:bCs/>
-        </w:rPr>
-        <w:t>Vite</w:t>
-      </w:r>
-      <w:r>
-        <w:t xml:space="preserve">, a ferramenta moderna que você está usando para rodar o projeto </w:t>
+        <w:rPr>
+          <w:rFonts w:ascii="Calibri" w:hAnsi="Calibri" w:cs="Calibri"/>
+          <w:sz w:val="24"/>
+          <w:szCs w:val="24"/>
+        </w:rPr>
+        <w:t xml:space="preserve">: Configurações do Vite, a ferramenta moderna que você está usando para rodar o projeto </w:t>
       </w:r>
       <w:proofErr w:type="spellStart"/>
       <w:r>
+        <w:rPr>
+          <w:rFonts w:ascii="Calibri" w:hAnsi="Calibri" w:cs="Calibri"/>
+          <w:sz w:val="24"/>
+          <w:szCs w:val="24"/>
+        </w:rPr>
         <w:t>frontend</w:t>
       </w:r>
       <w:proofErr w:type="spellEnd"/>
       <w:r>
+        <w:rPr>
+          <w:rFonts w:ascii="Calibri" w:hAnsi="Calibri" w:cs="Calibri"/>
+          <w:sz w:val="24"/>
+          <w:szCs w:val="24"/>
+        </w:rPr>
         <w:t xml:space="preserve"> de forma rápida.</w:t>
       </w:r>
     </w:p>
     <w:p>
-      <w:r>
+      <w:pPr>
+        <w:rPr>
+          <w:rFonts w:ascii="Calibri" w:hAnsi="Calibri" w:cs="Calibri"/>
+          <w:sz w:val="24"/>
+          <w:szCs w:val="24"/>
+        </w:rPr>
+      </w:pPr>
+      <w:r>
+        <w:rPr>
+          <w:rFonts w:ascii="Calibri" w:hAnsi="Calibri" w:cs="Calibri"/>
+          <w:sz w:val="24"/>
+          <w:szCs w:val="24"/>
+        </w:rPr>
         <w:pict w14:anchorId="36A81510">
-          <v:rect id="_x0000_i1038" style="width:0;height:1.5pt" o:hralign="center" o:hrstd="t" o:hr="t" fillcolor="#a0a0a0" stroked="f"/>
+          <v:rect id="_x0000_i1027" style="width:0;height:1.5pt" o:hralign="center" o:hrstd="t" o:hr="t" fillcolor="#a0a0a0" stroked="f"/>
         </w:pict>
       </w:r>
     </w:p>
     <w:p>
       <w:pPr>
         <w:rPr>
-          <w:b/>
-          <w:bCs/>
+          <w:rFonts w:ascii="Calibri" w:hAnsi="Calibri" w:cs="Calibri"/>
+          <w:sz w:val="24"/>
+          <w:szCs w:val="24"/>
         </w:rPr>
       </w:pPr>
       <w:r>
         <w:rPr>
           <w:rFonts w:ascii="Segoe UI Emoji" w:hAnsi="Segoe UI Emoji" w:cs="Segoe UI Emoji"/>
-          <w:b/>
-          <w:bCs/>
+          <w:sz w:val="24"/>
+          <w:szCs w:val="24"/>
         </w:rPr>
         <w:t>💻</w:t>
       </w:r>
       <w:r>
         <w:rPr>
-          <w:b/>
-          <w:bCs/>
+          <w:rFonts w:ascii="Calibri" w:hAnsi="Calibri" w:cs="Calibri"/>
+          <w:sz w:val="24"/>
+          <w:szCs w:val="24"/>
         </w:rPr>
         <w:t xml:space="preserve"> Arquivos Principais do Sistema</w:t>
       </w:r>
@@ -733,35 +2035,54 @@
           <w:ilvl w:val="0"/>
           <w:numId w:val="3"/>
         </w:numPr>
-      </w:pPr>
-      <w:r>
-        <w:rPr>
-          <w:b/>
-          <w:bCs/>
-        </w:rPr>
-        <w:t>server.js</w:t>
-      </w:r>
-      <w:r>
-        <w:t xml:space="preserve">: O seu </w:t>
+        <w:rPr>
+          <w:rFonts w:ascii="Calibri" w:hAnsi="Calibri" w:cs="Calibri"/>
+          <w:sz w:val="24"/>
+          <w:szCs w:val="24"/>
+        </w:rPr>
+      </w:pPr>
+      <w:r>
+        <w:rPr>
+          <w:rFonts w:ascii="Calibri" w:hAnsi="Calibri" w:cs="Calibri"/>
+          <w:sz w:val="24"/>
+          <w:szCs w:val="24"/>
+        </w:rPr>
+        <w:t xml:space="preserve">server.js: O seu </w:t>
       </w:r>
       <w:proofErr w:type="spellStart"/>
       <w:r>
         <w:rPr>
-          <w:b/>
-          <w:bCs/>
+          <w:rFonts w:ascii="Calibri" w:hAnsi="Calibri" w:cs="Calibri"/>
+          <w:sz w:val="24"/>
+          <w:szCs w:val="24"/>
         </w:rPr>
         <w:t>Backend</w:t>
       </w:r>
       <w:proofErr w:type="spellEnd"/>
       <w:r>
+        <w:rPr>
+          <w:rFonts w:ascii="Calibri" w:hAnsi="Calibri" w:cs="Calibri"/>
+          <w:sz w:val="24"/>
+          <w:szCs w:val="24"/>
+        </w:rPr>
         <w:t xml:space="preserve">. É aqui que configuramos as rotas de Login, Cadastro e o envio de e-mail através do </w:t>
       </w:r>
       <w:proofErr w:type="spellStart"/>
       <w:r>
+        <w:rPr>
+          <w:rFonts w:ascii="Calibri" w:hAnsi="Calibri" w:cs="Calibri"/>
+          <w:sz w:val="24"/>
+          <w:szCs w:val="24"/>
+        </w:rPr>
         <w:t>Nodemailer</w:t>
       </w:r>
       <w:proofErr w:type="spellEnd"/>
       <w:r>
+        <w:rPr>
+          <w:rFonts w:ascii="Calibri" w:hAnsi="Calibri" w:cs="Calibri"/>
+          <w:sz w:val="24"/>
+          <w:szCs w:val="24"/>
+        </w:rPr>
         <w:t>.</w:t>
       </w:r>
     </w:p>
@@ -771,23 +2092,36 @@
           <w:ilvl w:val="0"/>
           <w:numId w:val="3"/>
         </w:numPr>
-      </w:pPr>
-      <w:r>
-        <w:rPr>
-          <w:b/>
-          <w:bCs/>
-        </w:rPr>
-        <w:t>database.js</w:t>
-      </w:r>
-      <w:r>
-        <w:t xml:space="preserve">: Contém a lógica de conexão com o banco de dados e a criação das tabelas (id, nome, </w:t>
+        <w:rPr>
+          <w:rFonts w:ascii="Calibri" w:hAnsi="Calibri" w:cs="Calibri"/>
+          <w:sz w:val="24"/>
+          <w:szCs w:val="24"/>
+        </w:rPr>
+      </w:pPr>
+      <w:r>
+        <w:rPr>
+          <w:rFonts w:ascii="Calibri" w:hAnsi="Calibri" w:cs="Calibri"/>
+          <w:sz w:val="24"/>
+          <w:szCs w:val="24"/>
+        </w:rPr>
+        <w:t xml:space="preserve">database.js: Contém a lógica de conexão com o banco de dados e a criação das tabelas (id, nome, </w:t>
       </w:r>
       <w:proofErr w:type="spellStart"/>
       <w:r>
+        <w:rPr>
+          <w:rFonts w:ascii="Calibri" w:hAnsi="Calibri" w:cs="Calibri"/>
+          <w:sz w:val="24"/>
+          <w:szCs w:val="24"/>
+        </w:rPr>
         <w:t>email</w:t>
       </w:r>
       <w:proofErr w:type="spellEnd"/>
       <w:r>
+        <w:rPr>
+          <w:rFonts w:ascii="Calibri" w:hAnsi="Calibri" w:cs="Calibri"/>
+          <w:sz w:val="24"/>
+          <w:szCs w:val="24"/>
+        </w:rPr>
         <w:t>, senha).</w:t>
       </w:r>
     </w:p>
@@ -797,30 +2131,19 @@
           <w:ilvl w:val="0"/>
           <w:numId w:val="3"/>
         </w:numPr>
-      </w:pPr>
-      <w:proofErr w:type="spellStart"/>
-      <w:r>
-        <w:rPr>
-          <w:b/>
-          <w:bCs/>
-        </w:rPr>
-        <w:t>database.db</w:t>
-      </w:r>
-      <w:proofErr w:type="spellEnd"/>
-      <w:r>
-        <w:t xml:space="preserve">: O arquivo físico do seu banco de dados </w:t>
-      </w:r>
-      <w:proofErr w:type="spellStart"/>
-      <w:r>
-        <w:rPr>
-          <w:b/>
-          <w:bCs/>
-        </w:rPr>
-        <w:t>SQLite</w:t>
-      </w:r>
-      <w:proofErr w:type="spellEnd"/>
-      <w:r>
-        <w:t>. É aqui que as informações dos usuários ficam guardadas no seu computador.</w:t>
+        <w:rPr>
+          <w:rFonts w:ascii="Calibri" w:hAnsi="Calibri" w:cs="Calibri"/>
+          <w:sz w:val="24"/>
+          <w:szCs w:val="24"/>
+        </w:rPr>
+      </w:pPr>
+      <w:r>
+        <w:rPr>
+          <w:rFonts w:ascii="Calibri" w:hAnsi="Calibri" w:cs="Calibri"/>
+          <w:sz w:val="24"/>
+          <w:szCs w:val="24"/>
+        </w:rPr>
+        <w:t>database.db: O arquivo físico do seu banco de dados SQLite. É aqui que as informações dos usuários ficam guardadas no seu computador.</w:t>
       </w:r>
     </w:p>
     <w:p>
@@ -829,17 +2152,28 @@
           <w:ilvl w:val="0"/>
           <w:numId w:val="3"/>
         </w:numPr>
+        <w:rPr>
+          <w:rFonts w:ascii="Calibri" w:hAnsi="Calibri" w:cs="Calibri"/>
+          <w:sz w:val="24"/>
+          <w:szCs w:val="24"/>
+        </w:rPr>
       </w:pPr>
       <w:proofErr w:type="spellStart"/>
       <w:r>
         <w:rPr>
-          <w:b/>
-          <w:bCs/>
+          <w:rFonts w:ascii="Calibri" w:hAnsi="Calibri" w:cs="Calibri"/>
+          <w:sz w:val="24"/>
+          <w:szCs w:val="24"/>
         </w:rPr>
         <w:t>App.tsx</w:t>
       </w:r>
       <w:proofErr w:type="spellEnd"/>
       <w:r>
+        <w:rPr>
+          <w:rFonts w:ascii="Calibri" w:hAnsi="Calibri" w:cs="Calibri"/>
+          <w:sz w:val="24"/>
+          <w:szCs w:val="24"/>
+        </w:rPr>
         <w:t>: O componente principal do React que decide qual tela exibir para o usuário (Login ou o Painel Principal).</w:t>
       </w:r>
     </w:p>
@@ -849,16 +2183,19 @@
           <w:ilvl w:val="0"/>
           <w:numId w:val="3"/>
         </w:numPr>
-      </w:pPr>
-      <w:r>
-        <w:rPr>
-          <w:b/>
-          <w:bCs/>
-        </w:rPr>
-        <w:t>index.html</w:t>
-      </w:r>
-      <w:r>
-        <w:t>: O ponto de entrada do seu site no navegador; é onde o React é "montado" para aparecer na tela.</w:t>
+        <w:rPr>
+          <w:rFonts w:ascii="Calibri" w:hAnsi="Calibri" w:cs="Calibri"/>
+          <w:sz w:val="24"/>
+          <w:szCs w:val="24"/>
+        </w:rPr>
+      </w:pPr>
+      <w:r>
+        <w:rPr>
+          <w:rFonts w:ascii="Calibri" w:hAnsi="Calibri" w:cs="Calibri"/>
+          <w:sz w:val="24"/>
+          <w:szCs w:val="24"/>
+        </w:rPr>
+        <w:t>index.html: O ponto de entrada do seu site no navegador; é onde o React é "montado" para aparecer na tela.</w:t>
       </w:r>
     </w:p>
     <w:p>
@@ -867,20 +2204,30 @@
           <w:ilvl w:val="0"/>
           <w:numId w:val="3"/>
         </w:numPr>
-      </w:pPr>
-      <w:r>
-        <w:rPr>
-          <w:b/>
-          <w:bCs/>
-        </w:rPr>
-        <w:lastRenderedPageBreak/>
-        <w:t>README.md</w:t>
-      </w:r>
-      <w:r>
-        <w:t>: O arquivo de apresentação do seu projeto no GitHub. É aqui que você escreverá a documentação que estamos planejando.</w:t>
-      </w:r>
-    </w:p>
-    <w:p/>
+        <w:rPr>
+          <w:rFonts w:ascii="Calibri" w:hAnsi="Calibri" w:cs="Calibri"/>
+          <w:sz w:val="24"/>
+          <w:szCs w:val="24"/>
+        </w:rPr>
+      </w:pPr>
+      <w:r>
+        <w:rPr>
+          <w:rFonts w:ascii="Calibri" w:hAnsi="Calibri" w:cs="Calibri"/>
+          <w:sz w:val="24"/>
+          <w:szCs w:val="24"/>
+        </w:rPr>
+        <w:t>README.md: O arquivo de apresentação do seu projeto no GitHub. É aqui que você escreverá a documentação que estamos planejando.</w:t>
+      </w:r>
+    </w:p>
+    <w:p>
+      <w:pPr>
+        <w:rPr>
+          <w:rFonts w:ascii="Calibri" w:hAnsi="Calibri" w:cs="Calibri"/>
+          <w:sz w:val="24"/>
+          <w:szCs w:val="24"/>
+        </w:rPr>
+      </w:pPr>
+    </w:p>
     <w:sectPr>
       <w:pgSz w:w="11906" w:h="16838"/>
       <w:pgMar w:top="1417" w:right="1701" w:bottom="1417" w:left="1701" w:header="708" w:footer="708" w:gutter="0"/>
@@ -1340,6 +2687,566 @@
       </w:rPr>
     </w:lvl>
   </w:abstractNum>
+  <w:abstractNum w:abstractNumId="3" w15:restartNumberingAfterBreak="0">
+    <w:nsid w:val="42C36E51"/>
+    <w:multiLevelType w:val="multilevel"/>
+    <w:tmpl w:val="BFD6F182"/>
+    <w:lvl w:ilvl="0">
+      <w:start w:val="1"/>
+      <w:numFmt w:val="decimal"/>
+      <w:lvlText w:val="%1."/>
+      <w:lvlJc w:val="left"/>
+      <w:pPr>
+        <w:tabs>
+          <w:tab w:val="num" w:pos="720"/>
+        </w:tabs>
+        <w:ind w:left="720" w:hanging="360"/>
+      </w:pPr>
+    </w:lvl>
+    <w:lvl w:ilvl="1" w:tentative="1">
+      <w:start w:val="1"/>
+      <w:numFmt w:val="decimal"/>
+      <w:lvlText w:val="%2."/>
+      <w:lvlJc w:val="left"/>
+      <w:pPr>
+        <w:tabs>
+          <w:tab w:val="num" w:pos="1440"/>
+        </w:tabs>
+        <w:ind w:left="1440" w:hanging="360"/>
+      </w:pPr>
+    </w:lvl>
+    <w:lvl w:ilvl="2" w:tentative="1">
+      <w:start w:val="1"/>
+      <w:numFmt w:val="decimal"/>
+      <w:lvlText w:val="%3."/>
+      <w:lvlJc w:val="left"/>
+      <w:pPr>
+        <w:tabs>
+          <w:tab w:val="num" w:pos="2160"/>
+        </w:tabs>
+        <w:ind w:left="2160" w:hanging="360"/>
+      </w:pPr>
+    </w:lvl>
+    <w:lvl w:ilvl="3" w:tentative="1">
+      <w:start w:val="1"/>
+      <w:numFmt w:val="decimal"/>
+      <w:lvlText w:val="%4."/>
+      <w:lvlJc w:val="left"/>
+      <w:pPr>
+        <w:tabs>
+          <w:tab w:val="num" w:pos="2880"/>
+        </w:tabs>
+        <w:ind w:left="2880" w:hanging="360"/>
+      </w:pPr>
+    </w:lvl>
+    <w:lvl w:ilvl="4" w:tentative="1">
+      <w:start w:val="1"/>
+      <w:numFmt w:val="decimal"/>
+      <w:lvlText w:val="%5."/>
+      <w:lvlJc w:val="left"/>
+      <w:pPr>
+        <w:tabs>
+          <w:tab w:val="num" w:pos="3600"/>
+        </w:tabs>
+        <w:ind w:left="3600" w:hanging="360"/>
+      </w:pPr>
+    </w:lvl>
+    <w:lvl w:ilvl="5" w:tentative="1">
+      <w:start w:val="1"/>
+      <w:numFmt w:val="decimal"/>
+      <w:lvlText w:val="%6."/>
+      <w:lvlJc w:val="left"/>
+      <w:pPr>
+        <w:tabs>
+          <w:tab w:val="num" w:pos="4320"/>
+        </w:tabs>
+        <w:ind w:left="4320" w:hanging="360"/>
+      </w:pPr>
+    </w:lvl>
+    <w:lvl w:ilvl="6" w:tentative="1">
+      <w:start w:val="1"/>
+      <w:numFmt w:val="decimal"/>
+      <w:lvlText w:val="%7."/>
+      <w:lvlJc w:val="left"/>
+      <w:pPr>
+        <w:tabs>
+          <w:tab w:val="num" w:pos="5040"/>
+        </w:tabs>
+        <w:ind w:left="5040" w:hanging="360"/>
+      </w:pPr>
+    </w:lvl>
+    <w:lvl w:ilvl="7" w:tentative="1">
+      <w:start w:val="1"/>
+      <w:numFmt w:val="decimal"/>
+      <w:lvlText w:val="%8."/>
+      <w:lvlJc w:val="left"/>
+      <w:pPr>
+        <w:tabs>
+          <w:tab w:val="num" w:pos="5760"/>
+        </w:tabs>
+        <w:ind w:left="5760" w:hanging="360"/>
+      </w:pPr>
+    </w:lvl>
+    <w:lvl w:ilvl="8" w:tentative="1">
+      <w:start w:val="1"/>
+      <w:numFmt w:val="decimal"/>
+      <w:lvlText w:val="%9."/>
+      <w:lvlJc w:val="left"/>
+      <w:pPr>
+        <w:tabs>
+          <w:tab w:val="num" w:pos="6480"/>
+        </w:tabs>
+        <w:ind w:left="6480" w:hanging="360"/>
+      </w:pPr>
+    </w:lvl>
+  </w:abstractNum>
+  <w:abstractNum w:abstractNumId="4" w15:restartNumberingAfterBreak="0">
+    <w:nsid w:val="6159544A"/>
+    <w:multiLevelType w:val="multilevel"/>
+    <w:tmpl w:val="B6E29B0C"/>
+    <w:lvl w:ilvl="0">
+      <w:start w:val="1"/>
+      <w:numFmt w:val="bullet"/>
+      <w:lvlText w:val=""/>
+      <w:lvlJc w:val="left"/>
+      <w:pPr>
+        <w:tabs>
+          <w:tab w:val="num" w:pos="720"/>
+        </w:tabs>
+        <w:ind w:left="720" w:hanging="360"/>
+      </w:pPr>
+      <w:rPr>
+        <w:rFonts w:ascii="Symbol" w:hAnsi="Symbol" w:hint="default"/>
+        <w:sz w:val="20"/>
+      </w:rPr>
+    </w:lvl>
+    <w:lvl w:ilvl="1" w:tentative="1">
+      <w:start w:val="1"/>
+      <w:numFmt w:val="bullet"/>
+      <w:lvlText w:val="o"/>
+      <w:lvlJc w:val="left"/>
+      <w:pPr>
+        <w:tabs>
+          <w:tab w:val="num" w:pos="1440"/>
+        </w:tabs>
+        <w:ind w:left="1440" w:hanging="360"/>
+      </w:pPr>
+      <w:rPr>
+        <w:rFonts w:ascii="Courier New" w:hAnsi="Courier New" w:hint="default"/>
+        <w:sz w:val="20"/>
+      </w:rPr>
+    </w:lvl>
+    <w:lvl w:ilvl="2" w:tentative="1">
+      <w:start w:val="1"/>
+      <w:numFmt w:val="bullet"/>
+      <w:lvlText w:val=""/>
+      <w:lvlJc w:val="left"/>
+      <w:pPr>
+        <w:tabs>
+          <w:tab w:val="num" w:pos="2160"/>
+        </w:tabs>
+        <w:ind w:left="2160" w:hanging="360"/>
+      </w:pPr>
+      <w:rPr>
+        <w:rFonts w:ascii="Wingdings" w:hAnsi="Wingdings" w:hint="default"/>
+        <w:sz w:val="20"/>
+      </w:rPr>
+    </w:lvl>
+    <w:lvl w:ilvl="3" w:tentative="1">
+      <w:start w:val="1"/>
+      <w:numFmt w:val="bullet"/>
+      <w:lvlText w:val=""/>
+      <w:lvlJc w:val="left"/>
+      <w:pPr>
+        <w:tabs>
+          <w:tab w:val="num" w:pos="2880"/>
+        </w:tabs>
+        <w:ind w:left="2880" w:hanging="360"/>
+      </w:pPr>
+      <w:rPr>
+        <w:rFonts w:ascii="Wingdings" w:hAnsi="Wingdings" w:hint="default"/>
+        <w:sz w:val="20"/>
+      </w:rPr>
+    </w:lvl>
+    <w:lvl w:ilvl="4" w:tentative="1">
+      <w:start w:val="1"/>
+      <w:numFmt w:val="bullet"/>
+      <w:lvlText w:val=""/>
+      <w:lvlJc w:val="left"/>
+      <w:pPr>
+        <w:tabs>
+          <w:tab w:val="num" w:pos="3600"/>
+        </w:tabs>
+        <w:ind w:left="3600" w:hanging="360"/>
+      </w:pPr>
+      <w:rPr>
+        <w:rFonts w:ascii="Wingdings" w:hAnsi="Wingdings" w:hint="default"/>
+        <w:sz w:val="20"/>
+      </w:rPr>
+    </w:lvl>
+    <w:lvl w:ilvl="5" w:tentative="1">
+      <w:start w:val="1"/>
+      <w:numFmt w:val="bullet"/>
+      <w:lvlText w:val=""/>
+      <w:lvlJc w:val="left"/>
+      <w:pPr>
+        <w:tabs>
+          <w:tab w:val="num" w:pos="4320"/>
+        </w:tabs>
+        <w:ind w:left="4320" w:hanging="360"/>
+      </w:pPr>
+      <w:rPr>
+        <w:rFonts w:ascii="Wingdings" w:hAnsi="Wingdings" w:hint="default"/>
+        <w:sz w:val="20"/>
+      </w:rPr>
+    </w:lvl>
+    <w:lvl w:ilvl="6" w:tentative="1">
+      <w:start w:val="1"/>
+      <w:numFmt w:val="bullet"/>
+      <w:lvlText w:val=""/>
+      <w:lvlJc w:val="left"/>
+      <w:pPr>
+        <w:tabs>
+          <w:tab w:val="num" w:pos="5040"/>
+        </w:tabs>
+        <w:ind w:left="5040" w:hanging="360"/>
+      </w:pPr>
+      <w:rPr>
+        <w:rFonts w:ascii="Wingdings" w:hAnsi="Wingdings" w:hint="default"/>
+        <w:sz w:val="20"/>
+      </w:rPr>
+    </w:lvl>
+    <w:lvl w:ilvl="7" w:tentative="1">
+      <w:start w:val="1"/>
+      <w:numFmt w:val="bullet"/>
+      <w:lvlText w:val=""/>
+      <w:lvlJc w:val="left"/>
+      <w:pPr>
+        <w:tabs>
+          <w:tab w:val="num" w:pos="5760"/>
+        </w:tabs>
+        <w:ind w:left="5760" w:hanging="360"/>
+      </w:pPr>
+      <w:rPr>
+        <w:rFonts w:ascii="Wingdings" w:hAnsi="Wingdings" w:hint="default"/>
+        <w:sz w:val="20"/>
+      </w:rPr>
+    </w:lvl>
+    <w:lvl w:ilvl="8" w:tentative="1">
+      <w:start w:val="1"/>
+      <w:numFmt w:val="bullet"/>
+      <w:lvlText w:val=""/>
+      <w:lvlJc w:val="left"/>
+      <w:pPr>
+        <w:tabs>
+          <w:tab w:val="num" w:pos="6480"/>
+        </w:tabs>
+        <w:ind w:left="6480" w:hanging="360"/>
+      </w:pPr>
+      <w:rPr>
+        <w:rFonts w:ascii="Wingdings" w:hAnsi="Wingdings" w:hint="default"/>
+        <w:sz w:val="20"/>
+      </w:rPr>
+    </w:lvl>
+  </w:abstractNum>
+  <w:abstractNum w:abstractNumId="5" w15:restartNumberingAfterBreak="0">
+    <w:nsid w:val="66A648B5"/>
+    <w:multiLevelType w:val="multilevel"/>
+    <w:tmpl w:val="0B9CB9E8"/>
+    <w:lvl w:ilvl="0">
+      <w:start w:val="1"/>
+      <w:numFmt w:val="bullet"/>
+      <w:lvlText w:val=""/>
+      <w:lvlJc w:val="left"/>
+      <w:pPr>
+        <w:tabs>
+          <w:tab w:val="num" w:pos="720"/>
+        </w:tabs>
+        <w:ind w:left="720" w:hanging="360"/>
+      </w:pPr>
+      <w:rPr>
+        <w:rFonts w:ascii="Symbol" w:hAnsi="Symbol" w:hint="default"/>
+        <w:sz w:val="20"/>
+      </w:rPr>
+    </w:lvl>
+    <w:lvl w:ilvl="1" w:tentative="1">
+      <w:start w:val="1"/>
+      <w:numFmt w:val="bullet"/>
+      <w:lvlText w:val="o"/>
+      <w:lvlJc w:val="left"/>
+      <w:pPr>
+        <w:tabs>
+          <w:tab w:val="num" w:pos="1440"/>
+        </w:tabs>
+        <w:ind w:left="1440" w:hanging="360"/>
+      </w:pPr>
+      <w:rPr>
+        <w:rFonts w:ascii="Courier New" w:hAnsi="Courier New" w:hint="default"/>
+        <w:sz w:val="20"/>
+      </w:rPr>
+    </w:lvl>
+    <w:lvl w:ilvl="2" w:tentative="1">
+      <w:start w:val="1"/>
+      <w:numFmt w:val="bullet"/>
+      <w:lvlText w:val=""/>
+      <w:lvlJc w:val="left"/>
+      <w:pPr>
+        <w:tabs>
+          <w:tab w:val="num" w:pos="2160"/>
+        </w:tabs>
+        <w:ind w:left="2160" w:hanging="360"/>
+      </w:pPr>
+      <w:rPr>
+        <w:rFonts w:ascii="Wingdings" w:hAnsi="Wingdings" w:hint="default"/>
+        <w:sz w:val="20"/>
+      </w:rPr>
+    </w:lvl>
+    <w:lvl w:ilvl="3" w:tentative="1">
+      <w:start w:val="1"/>
+      <w:numFmt w:val="bullet"/>
+      <w:lvlText w:val=""/>
+      <w:lvlJc w:val="left"/>
+      <w:pPr>
+        <w:tabs>
+          <w:tab w:val="num" w:pos="2880"/>
+        </w:tabs>
+        <w:ind w:left="2880" w:hanging="360"/>
+      </w:pPr>
+      <w:rPr>
+        <w:rFonts w:ascii="Wingdings" w:hAnsi="Wingdings" w:hint="default"/>
+        <w:sz w:val="20"/>
+      </w:rPr>
+    </w:lvl>
+    <w:lvl w:ilvl="4" w:tentative="1">
+      <w:start w:val="1"/>
+      <w:numFmt w:val="bullet"/>
+      <w:lvlText w:val=""/>
+      <w:lvlJc w:val="left"/>
+      <w:pPr>
+        <w:tabs>
+          <w:tab w:val="num" w:pos="3600"/>
+        </w:tabs>
+        <w:ind w:left="3600" w:hanging="360"/>
+      </w:pPr>
+      <w:rPr>
+        <w:rFonts w:ascii="Wingdings" w:hAnsi="Wingdings" w:hint="default"/>
+        <w:sz w:val="20"/>
+      </w:rPr>
+    </w:lvl>
+    <w:lvl w:ilvl="5" w:tentative="1">
+      <w:start w:val="1"/>
+      <w:numFmt w:val="bullet"/>
+      <w:lvlText w:val=""/>
+      <w:lvlJc w:val="left"/>
+      <w:pPr>
+        <w:tabs>
+          <w:tab w:val="num" w:pos="4320"/>
+        </w:tabs>
+        <w:ind w:left="4320" w:hanging="360"/>
+      </w:pPr>
+      <w:rPr>
+        <w:rFonts w:ascii="Wingdings" w:hAnsi="Wingdings" w:hint="default"/>
+        <w:sz w:val="20"/>
+      </w:rPr>
+    </w:lvl>
+    <w:lvl w:ilvl="6" w:tentative="1">
+      <w:start w:val="1"/>
+      <w:numFmt w:val="bullet"/>
+      <w:lvlText w:val=""/>
+      <w:lvlJc w:val="left"/>
+      <w:pPr>
+        <w:tabs>
+          <w:tab w:val="num" w:pos="5040"/>
+        </w:tabs>
+        <w:ind w:left="5040" w:hanging="360"/>
+      </w:pPr>
+      <w:rPr>
+        <w:rFonts w:ascii="Wingdings" w:hAnsi="Wingdings" w:hint="default"/>
+        <w:sz w:val="20"/>
+      </w:rPr>
+    </w:lvl>
+    <w:lvl w:ilvl="7" w:tentative="1">
+      <w:start w:val="1"/>
+      <w:numFmt w:val="bullet"/>
+      <w:lvlText w:val=""/>
+      <w:lvlJc w:val="left"/>
+      <w:pPr>
+        <w:tabs>
+          <w:tab w:val="num" w:pos="5760"/>
+        </w:tabs>
+        <w:ind w:left="5760" w:hanging="360"/>
+      </w:pPr>
+      <w:rPr>
+        <w:rFonts w:ascii="Wingdings" w:hAnsi="Wingdings" w:hint="default"/>
+        <w:sz w:val="20"/>
+      </w:rPr>
+    </w:lvl>
+    <w:lvl w:ilvl="8" w:tentative="1">
+      <w:start w:val="1"/>
+      <w:numFmt w:val="bullet"/>
+      <w:lvlText w:val=""/>
+      <w:lvlJc w:val="left"/>
+      <w:pPr>
+        <w:tabs>
+          <w:tab w:val="num" w:pos="6480"/>
+        </w:tabs>
+        <w:ind w:left="6480" w:hanging="360"/>
+      </w:pPr>
+      <w:rPr>
+        <w:rFonts w:ascii="Wingdings" w:hAnsi="Wingdings" w:hint="default"/>
+        <w:sz w:val="20"/>
+      </w:rPr>
+    </w:lvl>
+  </w:abstractNum>
+  <w:abstractNum w:abstractNumId="6" w15:restartNumberingAfterBreak="0">
+    <w:nsid w:val="72421D71"/>
+    <w:multiLevelType w:val="multilevel"/>
+    <w:tmpl w:val="5DF625A0"/>
+    <w:lvl w:ilvl="0">
+      <w:start w:val="1"/>
+      <w:numFmt w:val="bullet"/>
+      <w:lvlText w:val=""/>
+      <w:lvlJc w:val="left"/>
+      <w:pPr>
+        <w:tabs>
+          <w:tab w:val="num" w:pos="720"/>
+        </w:tabs>
+        <w:ind w:left="720" w:hanging="360"/>
+      </w:pPr>
+      <w:rPr>
+        <w:rFonts w:ascii="Symbol" w:hAnsi="Symbol" w:hint="default"/>
+        <w:sz w:val="20"/>
+      </w:rPr>
+    </w:lvl>
+    <w:lvl w:ilvl="1" w:tentative="1">
+      <w:start w:val="1"/>
+      <w:numFmt w:val="bullet"/>
+      <w:lvlText w:val="o"/>
+      <w:lvlJc w:val="left"/>
+      <w:pPr>
+        <w:tabs>
+          <w:tab w:val="num" w:pos="1440"/>
+        </w:tabs>
+        <w:ind w:left="1440" w:hanging="360"/>
+      </w:pPr>
+      <w:rPr>
+        <w:rFonts w:ascii="Courier New" w:hAnsi="Courier New" w:hint="default"/>
+        <w:sz w:val="20"/>
+      </w:rPr>
+    </w:lvl>
+    <w:lvl w:ilvl="2" w:tentative="1">
+      <w:start w:val="1"/>
+      <w:numFmt w:val="bullet"/>
+      <w:lvlText w:val=""/>
+      <w:lvlJc w:val="left"/>
+      <w:pPr>
+        <w:tabs>
+          <w:tab w:val="num" w:pos="2160"/>
+        </w:tabs>
+        <w:ind w:left="2160" w:hanging="360"/>
+      </w:pPr>
+      <w:rPr>
+        <w:rFonts w:ascii="Wingdings" w:hAnsi="Wingdings" w:hint="default"/>
+        <w:sz w:val="20"/>
+      </w:rPr>
+    </w:lvl>
+    <w:lvl w:ilvl="3" w:tentative="1">
+      <w:start w:val="1"/>
+      <w:numFmt w:val="bullet"/>
+      <w:lvlText w:val=""/>
+      <w:lvlJc w:val="left"/>
+      <w:pPr>
+        <w:tabs>
+          <w:tab w:val="num" w:pos="2880"/>
+        </w:tabs>
+        <w:ind w:left="2880" w:hanging="360"/>
+      </w:pPr>
+      <w:rPr>
+        <w:rFonts w:ascii="Wingdings" w:hAnsi="Wingdings" w:hint="default"/>
+        <w:sz w:val="20"/>
+      </w:rPr>
+    </w:lvl>
+    <w:lvl w:ilvl="4" w:tentative="1">
+      <w:start w:val="1"/>
+      <w:numFmt w:val="bullet"/>
+      <w:lvlText w:val=""/>
+      <w:lvlJc w:val="left"/>
+      <w:pPr>
+        <w:tabs>
+          <w:tab w:val="num" w:pos="3600"/>
+        </w:tabs>
+        <w:ind w:left="3600" w:hanging="360"/>
+      </w:pPr>
+      <w:rPr>
+        <w:rFonts w:ascii="Wingdings" w:hAnsi="Wingdings" w:hint="default"/>
+        <w:sz w:val="20"/>
+      </w:rPr>
+    </w:lvl>
+    <w:lvl w:ilvl="5" w:tentative="1">
+      <w:start w:val="1"/>
+      <w:numFmt w:val="bullet"/>
+      <w:lvlText w:val=""/>
+      <w:lvlJc w:val="left"/>
+      <w:pPr>
+        <w:tabs>
+          <w:tab w:val="num" w:pos="4320"/>
+        </w:tabs>
+        <w:ind w:left="4320" w:hanging="360"/>
+      </w:pPr>
+      <w:rPr>
+        <w:rFonts w:ascii="Wingdings" w:hAnsi="Wingdings" w:hint="default"/>
+        <w:sz w:val="20"/>
+      </w:rPr>
+    </w:lvl>
+    <w:lvl w:ilvl="6" w:tentative="1">
+      <w:start w:val="1"/>
+      <w:numFmt w:val="bullet"/>
+      <w:lvlText w:val=""/>
+      <w:lvlJc w:val="left"/>
+      <w:pPr>
+        <w:tabs>
+          <w:tab w:val="num" w:pos="5040"/>
+        </w:tabs>
+        <w:ind w:left="5040" w:hanging="360"/>
+      </w:pPr>
+      <w:rPr>
+        <w:rFonts w:ascii="Wingdings" w:hAnsi="Wingdings" w:hint="default"/>
+        <w:sz w:val="20"/>
+      </w:rPr>
+    </w:lvl>
+    <w:lvl w:ilvl="7" w:tentative="1">
+      <w:start w:val="1"/>
+      <w:numFmt w:val="bullet"/>
+      <w:lvlText w:val=""/>
+      <w:lvlJc w:val="left"/>
+      <w:pPr>
+        <w:tabs>
+          <w:tab w:val="num" w:pos="5760"/>
+        </w:tabs>
+        <w:ind w:left="5760" w:hanging="360"/>
+      </w:pPr>
+      <w:rPr>
+        <w:rFonts w:ascii="Wingdings" w:hAnsi="Wingdings" w:hint="default"/>
+        <w:sz w:val="20"/>
+      </w:rPr>
+    </w:lvl>
+    <w:lvl w:ilvl="8" w:tentative="1">
+      <w:start w:val="1"/>
+      <w:numFmt w:val="bullet"/>
+      <w:lvlText w:val=""/>
+      <w:lvlJc w:val="left"/>
+      <w:pPr>
+        <w:tabs>
+          <w:tab w:val="num" w:pos="6480"/>
+        </w:tabs>
+        <w:ind w:left="6480" w:hanging="360"/>
+      </w:pPr>
+      <w:rPr>
+        <w:rFonts w:ascii="Wingdings" w:hAnsi="Wingdings" w:hint="default"/>
+        <w:sz w:val="20"/>
+      </w:rPr>
+    </w:lvl>
+  </w:abstractNum>
   <w:num w:numId="1" w16cid:durableId="1875118037">
     <w:abstractNumId w:val="2"/>
   </w:num>
@@ -1348,6 +3255,18 @@
   </w:num>
   <w:num w:numId="3" w16cid:durableId="722370370">
     <w:abstractNumId w:val="1"/>
+  </w:num>
+  <w:num w:numId="4" w16cid:durableId="2020739751">
+    <w:abstractNumId w:val="6"/>
+  </w:num>
+  <w:num w:numId="5" w16cid:durableId="1447624943">
+    <w:abstractNumId w:val="5"/>
+  </w:num>
+  <w:num w:numId="6" w16cid:durableId="1566380711">
+    <w:abstractNumId w:val="4"/>
+  </w:num>
+  <w:num w:numId="7" w16cid:durableId="1555199376">
+    <w:abstractNumId w:val="3"/>
   </w:num>
 </w:numbering>
 </file>

</xml_diff>